<commit_message>
feat: ship updated CV downloads and align public career facts
Replace the live Curitiba/Europe PDFs with the Florianópolis, TK Present, and OrbitAI 2-page resume so recruiters get current copy from the site.

Co-authored-by: Cursor <cursoragent@cursor.com>
</commit_message>
<xml_diff>
--- a/docs/resume/word/LucasCruz_CV_EN.docx
+++ b/docs/resume/word/LucasCruz_CV_EN.docx
@@ -4,10 +4,15 @@
   <w:body>
     <w:p>
       <w:pPr>
+        <w:keepNext w:val="0"/>
+        <w:keepLines/>
+        <w:widowControl/>
+        <w:spacing w:before="0" w:after="20" w:lineRule="exact" w:line="440"/>
         <w:jc w:val="center"/>
       </w:pPr>
       <w:r>
         <w:rPr>
+          <w:rFonts w:ascii="Calibri" w:hAnsi="Calibri" w:cs="Calibri" w:eastAsia="Calibri"/>
           <w:b/>
           <w:sz w:val="36"/>
         </w:rPr>
@@ -16,10 +21,15 @@
     </w:p>
     <w:p>
       <w:pPr>
+        <w:keepNext w:val="0"/>
+        <w:keepLines/>
+        <w:widowControl/>
+        <w:spacing w:before="0" w:after="20" w:lineRule="exact" w:line="280"/>
         <w:jc w:val="center"/>
       </w:pPr>
       <w:r>
         <w:rPr>
+          <w:rFonts w:ascii="Calibri" w:hAnsi="Calibri" w:cs="Calibri" w:eastAsia="Calibri"/>
           <w:b/>
           <w:sz w:val="22"/>
         </w:rPr>
@@ -28,37 +38,57 @@
     </w:p>
     <w:p>
       <w:pPr>
+        <w:keepNext w:val="0"/>
+        <w:keepLines/>
+        <w:widowControl/>
+        <w:spacing w:before="0" w:after="20" w:lineRule="exact" w:line="250"/>
         <w:jc w:val="center"/>
       </w:pPr>
       <w:r>
         <w:rPr>
-          <w:sz w:val="20"/>
+          <w:rFonts w:ascii="Calibri" w:hAnsi="Calibri" w:cs="Calibri" w:eastAsia="Calibri"/>
+          <w:sz w:val="19"/>
         </w:rPr>
         <w:t>+55 (21) 96552-9308 · dev.lucascruz@gmail.com · linkedin.com/in/lucas-cruz · devzurc.github.io/portfolio</w:t>
       </w:r>
     </w:p>
     <w:p>
+      <w:pPr>
+        <w:keepNext w:val="0"/>
+        <w:keepLines/>
+        <w:widowControl/>
+        <w:spacing w:before="0" w:after="20" w:lineRule="exact" w:line="250"/>
+        <w:jc w:val="center"/>
+      </w:pPr>
       <w:r>
         <w:rPr>
-          <w:sz w:val="20"/>
+          <w:rFonts w:ascii="Calibri" w:hAnsi="Calibri" w:cs="Calibri" w:eastAsia="Calibri"/>
+          <w:sz w:val="19"/>
         </w:rPr>
-        <w:t>Curitiba, Brazil · Open to relocation across Europe · Requires visa sponsorship</w:t>
+        <w:t>Florianópolis, Santa Catarina, Brazil · Requires visa sponsorship</w:t>
       </w:r>
     </w:p>
     <w:p>
       <w:pPr>
-        <w:spacing w:before="80" w:after="120"/>
+        <w:keepNext w:val="0"/>
+        <w:keepLines/>
+        <w:widowControl/>
+        <w:spacing w:before="80" w:after="40" w:lineRule="exact" w:line="80"/>
         <w:pBdr>
-          <w:bottom w:val="single" w:sz="6" w:space="1" w:color="CCCCCC"/>
+          <w:bottom w:val="single" w:sz="6" w:space="1" w:color="B0B0B0"/>
         </w:pBdr>
       </w:pPr>
     </w:p>
     <w:p>
       <w:pPr>
-        <w:spacing w:after="80"/>
+        <w:keepNext/>
+        <w:keepLines/>
+        <w:widowControl/>
+        <w:spacing w:before="40" w:after="60" w:lineRule="exact" w:line="280"/>
       </w:pPr>
       <w:r>
         <w:rPr>
+          <w:rFonts w:ascii="Calibri" w:hAnsi="Calibri" w:cs="Calibri" w:eastAsia="Calibri"/>
           <w:b/>
           <w:sz w:val="22"/>
         </w:rPr>
@@ -66,27 +96,41 @@
       </w:r>
     </w:p>
     <w:p>
+      <w:pPr>
+        <w:keepNext w:val="0"/>
+        <w:keepLines/>
+        <w:widowControl/>
+        <w:spacing w:before="0" w:after="20" w:lineRule="exact" w:line="250"/>
+      </w:pPr>
       <w:r>
         <w:rPr>
+          <w:rFonts w:ascii="Calibri" w:hAnsi="Calibri" w:cs="Calibri" w:eastAsia="Calibri"/>
           <w:sz w:val="20"/>
         </w:rPr>
-        <w:t>Senior Data Engineer and Gen. AI Automation Engineer with 5+ years of experience building production data pipelines, cloud lakehouses, and LLM/n8n automation across IoT, fintech, agribusiness, and automotive intelligence. Proven track record delivering end-to-end data platforms, governed analytics datasets, conversational AI workflows, automated reporting systems, and customer-facing product development and maintenance. Building a public portfolio of production AI platform systems (RAG, agents, evaluation, MCP, observability) over enterprise data through 2026. Fluent in English (C1); open to relocation across Europe.</w:t>
+        <w:t>Senior Data Engineer and Gen. AI Automation Engineer with 5+ years of experience building production data pipelines, cloud lakehouses, AI agents, and LLM/n8n automation across IoT, fintech, agribusiness, and automotive intelligence. Proven track record delivering end-to-end data platforms, governed analytics, conversational AI workflows, and customer-facing product development. Currently extending this work toward production AI platforms (RAG, agents, evaluation, MCP, observability) over enterprise data. Fluent in English (C1).</w:t>
       </w:r>
     </w:p>
     <w:p>
       <w:pPr>
-        <w:spacing w:before="80" w:after="120"/>
+        <w:keepNext w:val="0"/>
+        <w:keepLines/>
+        <w:widowControl/>
+        <w:spacing w:before="80" w:after="40" w:lineRule="exact" w:line="80"/>
         <w:pBdr>
-          <w:bottom w:val="single" w:sz="6" w:space="1" w:color="CCCCCC"/>
+          <w:bottom w:val="single" w:sz="6" w:space="1" w:color="B0B0B0"/>
         </w:pBdr>
       </w:pPr>
     </w:p>
     <w:p>
       <w:pPr>
-        <w:spacing w:after="80"/>
+        <w:keepNext/>
+        <w:keepLines/>
+        <w:widowControl/>
+        <w:spacing w:before="40" w:after="60" w:lineRule="exact" w:line="280"/>
       </w:pPr>
       <w:r>
         <w:rPr>
+          <w:rFonts w:ascii="Calibri" w:hAnsi="Calibri" w:cs="Calibri" w:eastAsia="Calibri"/>
           <w:b/>
           <w:sz w:val="22"/>
         </w:rPr>
@@ -95,24 +139,46 @@
     </w:p>
     <w:tbl>
       <w:tblPr>
-        <w:tblStyle w:val="TableGrid"/>
-        <w:tblW w:type="auto" w:w="0"/>
+        <w:tblW w:type="dxa" w:w="10318"/>
+        <w:tblLayout w:type="fixed"/>
         <w:tblLook w:firstColumn="1" w:firstRow="1" w:lastColumn="0" w:lastRow="0" w:noHBand="0" w:noVBand="1" w:val="04A0"/>
+        <w:tblBorders>
+          <w:top w:val="nil" w:sz="0" w:space="0" w:color="auto"/>
+          <w:left w:val="nil" w:sz="0" w:space="0" w:color="auto"/>
+          <w:bottom w:val="nil" w:sz="0" w:space="0" w:color="auto"/>
+          <w:right w:val="nil" w:sz="0" w:space="0" w:color="auto"/>
+          <w:insideH w:val="nil" w:sz="0" w:space="0" w:color="auto"/>
+          <w:insideV w:val="nil" w:sz="0" w:space="0" w:color="auto"/>
+        </w:tblBorders>
+        <w:tblCellMar>
+          <w:top w:w="20" w:type="dxa"/>
+          <w:left w:w="40" w:type="dxa"/>
+          <w:bottom w:w="20" w:type="dxa"/>
+          <w:right w:w="60" w:type="dxa"/>
+        </w:tblCellMar>
       </w:tblPr>
       <w:tblGrid>
-        <w:gridCol w:w="5256"/>
-        <w:gridCol w:w="5256"/>
+        <w:gridCol w:w="5159"/>
+        <w:gridCol w:w="5159"/>
       </w:tblGrid>
       <w:tr>
         <w:tc>
           <w:tcPr>
-            <w:tcW w:type="dxa" w:w="5256"/>
+            <w:tcW w:type="dxa" w:w="3198"/>
           </w:tcPr>
           <w:p>
+            <w:pPr>
+              <w:keepNext w:val="0"/>
+              <w:keepLines/>
+              <w:widowControl/>
+              <w:spacing w:before="20" w:after="20" w:lineRule="exact" w:line="240"/>
+            </w:pPr>
+            <w:r/>
             <w:r>
               <w:rPr>
+                <w:rFonts w:ascii="Calibri" w:hAnsi="Calibri" w:cs="Calibri" w:eastAsia="Calibri"/>
                 <w:b/>
-                <w:sz w:val="19"/>
+                <w:sz w:val="18"/>
               </w:rPr>
               <w:t>Gen. AI &amp; LLMs</w:t>
             </w:r>
@@ -120,12 +186,20 @@
         </w:tc>
         <w:tc>
           <w:tcPr>
-            <w:tcW w:type="dxa" w:w="5256"/>
+            <w:tcW w:type="dxa" w:w="7120"/>
           </w:tcPr>
           <w:p>
+            <w:pPr>
+              <w:keepNext w:val="0"/>
+              <w:keepLines/>
+              <w:widowControl/>
+              <w:spacing w:before="20" w:after="20" w:lineRule="exact" w:line="240"/>
+            </w:pPr>
+            <w:r/>
             <w:r>
               <w:rPr>
-                <w:sz w:val="19"/>
+                <w:rFonts w:ascii="Calibri" w:hAnsi="Calibri" w:cs="Calibri" w:eastAsia="Calibri"/>
+                <w:sz w:val="18"/>
               </w:rPr>
               <w:t>LLM Integration, AI Agents (OpenAI, Claude, Gemini…), RAG, Prompt Engineering, Chatbot Development</w:t>
             </w:r>
@@ -135,28 +209,44 @@
       <w:tr>
         <w:tc>
           <w:tcPr>
-            <w:tcW w:type="dxa" w:w="5256"/>
+            <w:tcW w:type="dxa" w:w="3198"/>
           </w:tcPr>
           <w:p>
+            <w:pPr>
+              <w:keepNext w:val="0"/>
+              <w:keepLines/>
+              <w:widowControl/>
+              <w:spacing w:before="20" w:after="20" w:lineRule="exact" w:line="240"/>
+            </w:pPr>
+            <w:r/>
             <w:r>
               <w:rPr>
+                <w:rFonts w:ascii="Calibri" w:hAnsi="Calibri" w:cs="Calibri" w:eastAsia="Calibri"/>
                 <w:b/>
-                <w:sz w:val="19"/>
+                <w:sz w:val="18"/>
               </w:rPr>
-              <w:t>Data Engineering, APIs &amp; Orchestration</w:t>
+              <w:t>Data Engineering &amp; Orchestration</w:t>
             </w:r>
           </w:p>
         </w:tc>
         <w:tc>
           <w:tcPr>
-            <w:tcW w:type="dxa" w:w="5256"/>
+            <w:tcW w:type="dxa" w:w="7120"/>
           </w:tcPr>
           <w:p>
+            <w:pPr>
+              <w:keepNext w:val="0"/>
+              <w:keepLines/>
+              <w:widowControl/>
+              <w:spacing w:before="20" w:after="20" w:lineRule="exact" w:line="240"/>
+            </w:pPr>
+            <w:r/>
             <w:r>
               <w:rPr>
-                <w:sz w:val="19"/>
+                <w:rFonts w:ascii="Calibri" w:hAnsi="Calibri" w:cs="Calibri" w:eastAsia="Calibri"/>
+                <w:sz w:val="18"/>
               </w:rPr>
-              <w:t>Python, SQL, NestJS, Next.js, FastAPI, SQLAlchemy, Pydantic, Apache Spark (PySpark), Pandas, dbt, Trino, REST APIs, Web Scraping, Parquet, Apache Airflow, n8n, Celery, Redis Streams, Meta Cloud API</w:t>
+              <w:t>Python, SQL, Apache Spark (PySpark), Pandas, FastAPI, NestJS, Next.js, dbt, Trino, REST APIs, Web Scraping, Playwright, Parquet, Apache Airflow, n8n, Celery, Redis, Meta Cloud API</w:t>
             </w:r>
           </w:p>
         </w:tc>
@@ -164,13 +254,21 @@
       <w:tr>
         <w:tc>
           <w:tcPr>
-            <w:tcW w:type="dxa" w:w="5256"/>
+            <w:tcW w:type="dxa" w:w="3198"/>
           </w:tcPr>
           <w:p>
+            <w:pPr>
+              <w:keepNext w:val="0"/>
+              <w:keepLines/>
+              <w:widowControl/>
+              <w:spacing w:before="20" w:after="20" w:lineRule="exact" w:line="240"/>
+            </w:pPr>
+            <w:r/>
             <w:r>
               <w:rPr>
+                <w:rFonts w:ascii="Calibri" w:hAnsi="Calibri" w:cs="Calibri" w:eastAsia="Calibri"/>
                 <w:b/>
-                <w:sz w:val="19"/>
+                <w:sz w:val="18"/>
               </w:rPr>
               <w:t>Cloud &amp; Lakehouses</w:t>
             </w:r>
@@ -178,12 +276,20 @@
         </w:tc>
         <w:tc>
           <w:tcPr>
-            <w:tcW w:type="dxa" w:w="5256"/>
+            <w:tcW w:type="dxa" w:w="7120"/>
           </w:tcPr>
           <w:p>
+            <w:pPr>
+              <w:keepNext w:val="0"/>
+              <w:keepLines/>
+              <w:widowControl/>
+              <w:spacing w:before="20" w:after="20" w:lineRule="exact" w:line="240"/>
+            </w:pPr>
+            <w:r/>
             <w:r>
               <w:rPr>
-                <w:sz w:val="19"/>
+                <w:rFonts w:ascii="Calibri" w:hAnsi="Calibri" w:cs="Calibri" w:eastAsia="Calibri"/>
+                <w:sz w:val="18"/>
               </w:rPr>
               <w:t>Amazon Web Service (AWS), Microsoft Azure, Google Cloud (GCP), Oracle Cloud (OCI), Snowflake, Databricks, Amazon Redshift, Delta Lake, Oracle Autonomous Database</w:t>
             </w:r>
@@ -193,26 +299,42 @@
       <w:tr>
         <w:tc>
           <w:tcPr>
-            <w:tcW w:type="dxa" w:w="5256"/>
+            <w:tcW w:type="dxa" w:w="3198"/>
           </w:tcPr>
           <w:p>
+            <w:pPr>
+              <w:keepNext w:val="0"/>
+              <w:keepLines/>
+              <w:widowControl/>
+              <w:spacing w:before="20" w:after="20" w:lineRule="exact" w:line="240"/>
+            </w:pPr>
+            <w:r/>
             <w:r>
               <w:rPr>
+                <w:rFonts w:ascii="Calibri" w:hAnsi="Calibri" w:cs="Calibri" w:eastAsia="Calibri"/>
                 <w:b/>
-                <w:sz w:val="19"/>
+                <w:sz w:val="18"/>
               </w:rPr>
-              <w:t>Databases &amp; BI</w:t>
+              <w:t>Relational Databases &amp; BI</w:t>
             </w:r>
           </w:p>
         </w:tc>
         <w:tc>
           <w:tcPr>
-            <w:tcW w:type="dxa" w:w="5256"/>
+            <w:tcW w:type="dxa" w:w="7120"/>
           </w:tcPr>
           <w:p>
+            <w:pPr>
+              <w:keepNext w:val="0"/>
+              <w:keepLines/>
+              <w:widowControl/>
+              <w:spacing w:before="20" w:after="20" w:lineRule="exact" w:line="240"/>
+            </w:pPr>
+            <w:r/>
             <w:r>
               <w:rPr>
-                <w:sz w:val="19"/>
+                <w:rFonts w:ascii="Calibri" w:hAnsi="Calibri" w:cs="Calibri" w:eastAsia="Calibri"/>
+                <w:sz w:val="18"/>
               </w:rPr>
               <w:t>PostgreSQL, SQL Server, MySQL, Redis, Power BI, Qlik Sense, Apache Superset, Looker</w:t>
             </w:r>
@@ -222,13 +344,21 @@
       <w:tr>
         <w:tc>
           <w:tcPr>
-            <w:tcW w:type="dxa" w:w="5256"/>
+            <w:tcW w:type="dxa" w:w="3198"/>
           </w:tcPr>
           <w:p>
+            <w:pPr>
+              <w:keepNext w:val="0"/>
+              <w:keepLines/>
+              <w:widowControl/>
+              <w:spacing w:before="20" w:after="20" w:lineRule="exact" w:line="240"/>
+            </w:pPr>
+            <w:r/>
             <w:r>
               <w:rPr>
+                <w:rFonts w:ascii="Calibri" w:hAnsi="Calibri" w:cs="Calibri" w:eastAsia="Calibri"/>
                 <w:b/>
-                <w:sz w:val="19"/>
+                <w:sz w:val="18"/>
               </w:rPr>
               <w:t>Security &amp; Data Governance</w:t>
             </w:r>
@@ -236,12 +366,20 @@
         </w:tc>
         <w:tc>
           <w:tcPr>
-            <w:tcW w:type="dxa" w:w="5256"/>
+            <w:tcW w:type="dxa" w:w="7120"/>
           </w:tcPr>
           <w:p>
+            <w:pPr>
+              <w:keepNext w:val="0"/>
+              <w:keepLines/>
+              <w:widowControl/>
+              <w:spacing w:before="20" w:after="20" w:lineRule="exact" w:line="240"/>
+            </w:pPr>
+            <w:r/>
             <w:r>
               <w:rPr>
-                <w:sz w:val="19"/>
+                <w:rFonts w:ascii="Calibri" w:hAnsi="Calibri" w:cs="Calibri" w:eastAsia="Calibri"/>
+                <w:sz w:val="18"/>
               </w:rPr>
               <w:t>LGPD/GDPR Compliance, Data Privacy, IAM, RBAC, Data Masking, Encryption (Rest/Transit), Audit Logging, RFID/NFC Tagging, Firewall</w:t>
             </w:r>
@@ -251,13 +389,21 @@
       <w:tr>
         <w:tc>
           <w:tcPr>
-            <w:tcW w:type="dxa" w:w="5256"/>
+            <w:tcW w:type="dxa" w:w="3198"/>
           </w:tcPr>
           <w:p>
+            <w:pPr>
+              <w:keepNext w:val="0"/>
+              <w:keepLines/>
+              <w:widowControl/>
+              <w:spacing w:before="20" w:after="20" w:lineRule="exact" w:line="240"/>
+            </w:pPr>
+            <w:r/>
             <w:r>
               <w:rPr>
+                <w:rFonts w:ascii="Calibri" w:hAnsi="Calibri" w:cs="Calibri" w:eastAsia="Calibri"/>
                 <w:b/>
-                <w:sz w:val="19"/>
+                <w:sz w:val="18"/>
               </w:rPr>
               <w:t>DevOps &amp; Infrastructure</w:t>
             </w:r>
@@ -265,14 +411,22 @@
         </w:tc>
         <w:tc>
           <w:tcPr>
-            <w:tcW w:type="dxa" w:w="5256"/>
+            <w:tcW w:type="dxa" w:w="7120"/>
           </w:tcPr>
           <w:p>
+            <w:pPr>
+              <w:keepNext w:val="0"/>
+              <w:keepLines/>
+              <w:widowControl/>
+              <w:spacing w:before="20" w:after="20" w:lineRule="exact" w:line="240"/>
+            </w:pPr>
+            <w:r/>
             <w:r>
               <w:rPr>
-                <w:sz w:val="19"/>
+                <w:rFonts w:ascii="Calibri" w:hAnsi="Calibri" w:cs="Calibri" w:eastAsia="Calibri"/>
+                <w:sz w:val="18"/>
               </w:rPr>
-              <w:t>Docker, Kubernetes, Terraform, Azure Bicep, Azure Container Apps, Git, CI/CD Pipelines, Linux, Bash Scripting</w:t>
+              <w:t>Docker, Kubernetes, Azure Bicep, Azure Container Apps, Git, CI/CD Pipelines, Linux, Bash Scripting</w:t>
             </w:r>
           </w:p>
         </w:tc>
@@ -280,13 +434,21 @@
       <w:tr>
         <w:tc>
           <w:tcPr>
-            <w:tcW w:type="dxa" w:w="5256"/>
+            <w:tcW w:type="dxa" w:w="3198"/>
           </w:tcPr>
           <w:p>
+            <w:pPr>
+              <w:keepNext w:val="0"/>
+              <w:keepLines/>
+              <w:widowControl/>
+              <w:spacing w:before="20" w:after="20" w:lineRule="exact" w:line="240"/>
+            </w:pPr>
+            <w:r/>
             <w:r>
               <w:rPr>
+                <w:rFonts w:ascii="Calibri" w:hAnsi="Calibri" w:cs="Calibri" w:eastAsia="Calibri"/>
                 <w:b/>
-                <w:sz w:val="19"/>
+                <w:sz w:val="18"/>
               </w:rPr>
               <w:t>Languages</w:t>
             </w:r>
@@ -294,12 +456,20 @@
         </w:tc>
         <w:tc>
           <w:tcPr>
-            <w:tcW w:type="dxa" w:w="5256"/>
+            <w:tcW w:type="dxa" w:w="7120"/>
           </w:tcPr>
           <w:p>
+            <w:pPr>
+              <w:keepNext w:val="0"/>
+              <w:keepLines/>
+              <w:widowControl/>
+              <w:spacing w:before="20" w:after="20" w:lineRule="exact" w:line="240"/>
+            </w:pPr>
+            <w:r/>
             <w:r>
               <w:rPr>
-                <w:sz w:val="19"/>
+                <w:rFonts w:ascii="Calibri" w:hAnsi="Calibri" w:cs="Calibri" w:eastAsia="Calibri"/>
+                <w:sz w:val="18"/>
               </w:rPr>
               <w:t>Portuguese (Native) · English (C1 – Advanced) · Spanish (B1 – Intermediate)</w:t>
             </w:r>
@@ -309,18 +479,25 @@
     </w:tbl>
     <w:p>
       <w:pPr>
-        <w:spacing w:before="80" w:after="120"/>
+        <w:keepNext w:val="0"/>
+        <w:keepLines/>
+        <w:widowControl/>
+        <w:spacing w:before="80" w:after="40" w:lineRule="exact" w:line="80"/>
         <w:pBdr>
-          <w:bottom w:val="single" w:sz="6" w:space="1" w:color="CCCCCC"/>
+          <w:bottom w:val="single" w:sz="6" w:space="1" w:color="B0B0B0"/>
         </w:pBdr>
       </w:pPr>
     </w:p>
     <w:p>
       <w:pPr>
-        <w:spacing w:after="80"/>
+        <w:keepNext/>
+        <w:keepLines/>
+        <w:widowControl/>
+        <w:spacing w:before="40" w:after="60" w:lineRule="exact" w:line="280"/>
       </w:pPr>
       <w:r>
         <w:rPr>
+          <w:rFonts w:ascii="Calibri" w:hAnsi="Calibri" w:cs="Calibri" w:eastAsia="Calibri"/>
           <w:b/>
           <w:sz w:val="22"/>
         </w:rPr>
@@ -329,46 +506,64 @@
     </w:p>
     <w:p>
       <w:pPr>
-        <w:spacing w:before="120" w:after="40"/>
+        <w:keepNext/>
+        <w:keepLines/>
+        <w:widowControl/>
+        <w:tabs>
+          <w:tab w:pos="10318" w:val="right"/>
+        </w:tabs>
+        <w:spacing w:before="100" w:after="20" w:lineRule="exact" w:line="260"/>
       </w:pPr>
       <w:r>
         <w:rPr>
+          <w:rFonts w:ascii="Calibri" w:hAnsi="Calibri" w:cs="Calibri" w:eastAsia="Calibri"/>
           <w:b/>
           <w:sz w:val="21"/>
         </w:rPr>
-        <w:t>Gen. AI Engineer — TK Technologies</w:t>
+        <w:t>Gen. AI Engineer — TK Technologies | Curitiba, PR – Brazil (Hybrid)</w:t>
       </w:r>
-    </w:p>
-    <w:p>
+      <w:r>
+        <w:tab/>
+      </w:r>
       <w:r>
         <w:rPr>
-          <w:sz w:val="20"/>
+          <w:rFonts w:ascii="Calibri" w:hAnsi="Calibri" w:cs="Calibri" w:eastAsia="Calibri"/>
+          <w:i/>
+          <w:sz w:val="19"/>
         </w:rPr>
-        <w:t>Curitiba, PR – Brazil (Hybrid) · Feb 2026 – Present · 6-month contract, expected Aug 2026</w:t>
+        <w:t>Feb 2026 – Present · Contract</w:t>
       </w:r>
     </w:p>
     <w:p>
       <w:pPr>
         <w:pStyle w:val="ListBullet"/>
-        <w:spacing w:after="40"/>
-        <w:ind w:left="216"/>
+        <w:keepNext w:val="0"/>
+        <w:keepLines/>
+        <w:widowControl/>
+        <w:spacing w:before="0" w:after="20" w:lineRule="exact" w:line="240"/>
+        <w:ind w:left="255" w:hanging="142"/>
       </w:pPr>
       <w:r>
         <w:rPr>
-          <w:sz w:val="20"/>
+          <w:rFonts w:ascii="Calibri" w:hAnsi="Calibri" w:cs="Calibri" w:eastAsia="Calibri"/>
+          <w:sz w:val="19"/>
         </w:rPr>
-        <w:t>Architected an omnichannel AI CRM platform (integrating WhatsApp, Instagram, Facebook, Telegram, and Email) with role-based data governance, Meta/Google Ads tracking, and LLM-powered auto-replies, deploying to Azure Container Apps with Bicep IaC.</w:t>
+        <w:t>Architected OrbitAI, an omnichannel AI CRM platform (WhatsApp, Instagram, Facebook, Telegram, and Email) with role-based data governance, Meta/Google Ads tracking, and LLM-powered auto-replies, deploying to Azure Container Apps with Bicep IaC.</w:t>
       </w:r>
     </w:p>
     <w:p>
       <w:pPr>
         <w:pStyle w:val="ListBullet"/>
-        <w:spacing w:after="40"/>
-        <w:ind w:left="216"/>
+        <w:keepNext w:val="0"/>
+        <w:keepLines/>
+        <w:widowControl/>
+        <w:spacing w:before="0" w:after="20" w:lineRule="exact" w:line="240"/>
+        <w:ind w:left="255" w:hanging="142"/>
       </w:pPr>
       <w:r>
         <w:rPr>
-          <w:sz w:val="20"/>
+          <w:rFonts w:ascii="Calibri" w:hAnsi="Calibri" w:cs="Calibri" w:eastAsia="Calibri"/>
+          <w:sz w:val="19"/>
         </w:rPr>
         <w:t>Engineered a multi-source web scraping pipeline in Python targeting 10+ automotive parts websites, extracting pricing and product metadata at scale to deliver competitive market intelligence.</w:t>
       </w:r>
@@ -376,12 +571,16 @@
     <w:p>
       <w:pPr>
         <w:pStyle w:val="ListBullet"/>
-        <w:spacing w:after="40"/>
-        <w:ind w:left="216"/>
+        <w:keepNext w:val="0"/>
+        <w:keepLines/>
+        <w:widowControl/>
+        <w:spacing w:before="0" w:after="20" w:lineRule="exact" w:line="240"/>
+        <w:ind w:left="255" w:hanging="142"/>
       </w:pPr>
       <w:r>
         <w:rPr>
-          <w:sz w:val="20"/>
+          <w:rFonts w:ascii="Calibri" w:hAnsi="Calibri" w:cs="Calibri" w:eastAsia="Calibri"/>
+          <w:sz w:val="19"/>
         </w:rPr>
         <w:t>Architected AI-powered n8n automation workflows (ETL, RPA, and chatbot agents) by integrating LLMs (Claude AI, Google AI Studio) and GCP APIs (Sheets, Drive) to enrich datasets and reduce manual analysis work.</w:t>
       </w:r>
@@ -389,12 +588,16 @@
     <w:p>
       <w:pPr>
         <w:pStyle w:val="ListBullet"/>
-        <w:spacing w:after="40"/>
-        <w:ind w:left="216"/>
+        <w:keepNext w:val="0"/>
+        <w:keepLines/>
+        <w:widowControl/>
+        <w:spacing w:before="0" w:after="20" w:lineRule="exact" w:line="240"/>
+        <w:ind w:left="255" w:hanging="142"/>
       </w:pPr>
       <w:r>
         <w:rPr>
-          <w:sz w:val="20"/>
+          <w:rFonts w:ascii="Calibri" w:hAnsi="Calibri" w:cs="Calibri" w:eastAsia="Calibri"/>
+          <w:sz w:val="19"/>
         </w:rPr>
         <w:t>Developed a conversational AI chatbot that empowers business users to query and refine pricing datasets via natural language, reducing time-to-insight for non-technical stakeholders.</w:t>
       </w:r>
@@ -402,45 +605,63 @@
     <w:p>
       <w:pPr>
         <w:pStyle w:val="ListBullet"/>
-        <w:spacing w:after="40"/>
-        <w:ind w:left="216"/>
+        <w:keepNext w:val="0"/>
+        <w:keepLines/>
+        <w:widowControl/>
+        <w:spacing w:before="0" w:after="20" w:lineRule="exact" w:line="240"/>
+        <w:ind w:left="255" w:hanging="142"/>
       </w:pPr>
       <w:r>
         <w:rPr>
-          <w:sz w:val="20"/>
+          <w:rFonts w:ascii="Calibri" w:hAnsi="Calibri" w:cs="Calibri" w:eastAsia="Calibri"/>
+          <w:sz w:val="19"/>
         </w:rPr>
-        <w:t>Coordinated Notion-based delivery sprints, customer-facing demos, product training, sales support, and post-launch support; currently contribute to a new TK web presence and ongoing CRM product development and maintenance using public-safe delivery descriptions.</w:t>
+        <w:t>Coordinated Notion-based delivery sprints, customer-facing demos, product training, sales support, and post-launch support; contribute to the TK web presence and ongoing CRM product development and maintenance.</w:t>
       </w:r>
     </w:p>
     <w:p>
       <w:pPr>
-        <w:spacing w:before="120" w:after="40"/>
+        <w:keepNext/>
+        <w:keepLines/>
+        <w:widowControl/>
+        <w:tabs>
+          <w:tab w:pos="10318" w:val="right"/>
+        </w:tabs>
+        <w:spacing w:before="100" w:after="20" w:lineRule="exact" w:line="260"/>
       </w:pPr>
       <w:r>
         <w:rPr>
+          <w:rFonts w:ascii="Calibri" w:hAnsi="Calibri" w:cs="Calibri" w:eastAsia="Calibri"/>
           <w:b/>
           <w:sz w:val="21"/>
         </w:rPr>
-        <w:t>Data Engineer — Spacecom Monitoramento</w:t>
+        <w:t>Data Engineer — Spacecom Monitoramento | Curitiba, PR – Brazil (On-site)</w:t>
       </w:r>
-    </w:p>
-    <w:p>
+      <w:r>
+        <w:tab/>
+      </w:r>
       <w:r>
         <w:rPr>
-          <w:sz w:val="20"/>
+          <w:rFonts w:ascii="Calibri" w:hAnsi="Calibri" w:cs="Calibri" w:eastAsia="Calibri"/>
+          <w:i/>
+          <w:sz w:val="19"/>
         </w:rPr>
-        <w:t>Curitiba, PR – Brazil (On-site) · Apr 2023 – Jul 2024</w:t>
+        <w:t>Apr 2023 – Jul 2024</w:t>
       </w:r>
     </w:p>
     <w:p>
       <w:pPr>
         <w:pStyle w:val="ListBullet"/>
-        <w:spacing w:after="40"/>
-        <w:ind w:left="216"/>
+        <w:keepNext w:val="0"/>
+        <w:keepLines/>
+        <w:widowControl/>
+        <w:spacing w:before="0" w:after="20" w:lineRule="exact" w:line="240"/>
+        <w:ind w:left="255" w:hanging="142"/>
       </w:pPr>
       <w:r>
         <w:rPr>
-          <w:sz w:val="20"/>
+          <w:rFonts w:ascii="Calibri" w:hAnsi="Calibri" w:cs="Calibri" w:eastAsia="Calibri"/>
+          <w:sz w:val="19"/>
         </w:rPr>
         <w:t>Designed and maintained an enterprise Big Data Lakehouse on AWS S3 leveraging Medallion Architecture (Bronze/Silver/Gold) alongside Delta Lake, Parquet, PySpark, and Trino to support heavy analytics workloads.</w:t>
       </w:r>
@@ -448,12 +669,16 @@
     <w:p>
       <w:pPr>
         <w:pStyle w:val="ListBullet"/>
-        <w:spacing w:after="40"/>
-        <w:ind w:left="216"/>
+        <w:keepNext w:val="0"/>
+        <w:keepLines/>
+        <w:widowControl/>
+        <w:spacing w:before="0" w:after="20" w:lineRule="exact" w:line="240"/>
+        <w:ind w:left="255" w:hanging="142"/>
       </w:pPr>
       <w:r>
         <w:rPr>
-          <w:sz w:val="20"/>
+          <w:rFonts w:ascii="Calibri" w:hAnsi="Calibri" w:cs="Calibri" w:eastAsia="Calibri"/>
+          <w:sz w:val="19"/>
         </w:rPr>
         <w:t>Supported a high-availability IoT platform scaling to 95,000+ devices, efficiently processing hundreds of millions of telemetry records per day.</w:t>
       </w:r>
@@ -461,71 +686,97 @@
     <w:p>
       <w:pPr>
         <w:pStyle w:val="ListBullet"/>
-        <w:spacing w:after="40"/>
-        <w:ind w:left="216"/>
+        <w:keepNext w:val="0"/>
+        <w:keepLines/>
+        <w:widowControl/>
+        <w:spacing w:before="0" w:after="20" w:lineRule="exact" w:line="240"/>
+        <w:ind w:left="255" w:hanging="142"/>
       </w:pPr>
       <w:r>
         <w:rPr>
-          <w:sz w:val="20"/>
+          <w:rFonts w:ascii="Calibri" w:hAnsi="Calibri" w:cs="Calibri" w:eastAsia="Calibri"/>
+          <w:sz w:val="19"/>
         </w:rPr>
-        <w:t>Managed electronic security tag (RFID/NFC) data for government court systems, applying LGPD/GDPR-aligned privacy controls, access governance, and secure handling of sensitive judicial data.</w:t>
+        <w:t>Managed electronic security tag (RFID/NFC) data for government court systems, ensuring strict LGPD/GDPR compliance through robust data privacy controls, access governance, and secure handling of sensitive judicial data.</w:t>
       </w:r>
     </w:p>
     <w:p>
       <w:pPr>
         <w:pStyle w:val="ListBullet"/>
-        <w:spacing w:after="40"/>
-        <w:ind w:left="216"/>
+        <w:keepNext w:val="0"/>
+        <w:keepLines/>
+        <w:widowControl/>
+        <w:spacing w:before="0" w:after="20" w:lineRule="exact" w:line="240"/>
+        <w:ind w:left="255" w:hanging="142"/>
       </w:pPr>
       <w:r>
         <w:rPr>
-          <w:sz w:val="20"/>
+          <w:rFonts w:ascii="Calibri" w:hAnsi="Calibri" w:cs="Calibri" w:eastAsia="Calibri"/>
+          <w:sz w:val="19"/>
         </w:rPr>
-        <w:t>Orchestrated and optimised ETL pipelines with Apache Airflow to improve pipeline reliability; utilised Docker on AWS EC2 to reduce deployment issues.</w:t>
+        <w:t>Orchestrated and optimised ETL pipelines with Apache Airflow, reducing failure rates by ~30%; utilised Docker on AWS EC2 to cut deployment issues by an additional ~25%.</w:t>
       </w:r>
     </w:p>
     <w:p>
       <w:pPr>
         <w:pStyle w:val="ListBullet"/>
-        <w:spacing w:after="40"/>
-        <w:ind w:left="216"/>
+        <w:keepNext w:val="0"/>
+        <w:keepLines/>
+        <w:widowControl/>
+        <w:spacing w:before="0" w:after="20" w:lineRule="exact" w:line="240"/>
+        <w:ind w:left="255" w:hanging="142"/>
       </w:pPr>
       <w:r>
         <w:rPr>
-          <w:sz w:val="20"/>
+          <w:rFonts w:ascii="Calibri" w:hAnsi="Calibri" w:cs="Calibri" w:eastAsia="Calibri"/>
+          <w:sz w:val="19"/>
         </w:rPr>
-        <w:t>Remediated inconsistencies in pipeline steps to improve downstream analytics consistency, delivering reliable datasets to Qlik Sense and Apache Superset dashboards.</w:t>
+        <w:t>Remediated inconsistencies in pipeline steps to boost downstream analytics accuracy by ~40%, successfully delivering reliable datasets to Qlik Sense and Apache Superset dashboards.</w:t>
       </w:r>
     </w:p>
     <w:p>
       <w:pPr>
-        <w:spacing w:before="120" w:after="40"/>
+        <w:keepNext/>
+        <w:keepLines/>
+        <w:widowControl/>
+        <w:tabs>
+          <w:tab w:pos="10318" w:val="right"/>
+        </w:tabs>
+        <w:spacing w:before="100" w:after="20" w:lineRule="exact" w:line="260"/>
       </w:pPr>
       <w:r>
         <w:rPr>
+          <w:rFonts w:ascii="Calibri" w:hAnsi="Calibri" w:cs="Calibri" w:eastAsia="Calibri"/>
           <w:b/>
           <w:sz w:val="21"/>
         </w:rPr>
-        <w:t>Data Engineer Consultant — wDiscover</w:t>
+        <w:t>Data Engineer Consultant — wDiscover | Curitiba, PR – Brazil (Remote)</w:t>
       </w:r>
-    </w:p>
-    <w:p>
+      <w:r>
+        <w:tab/>
+      </w:r>
       <w:r>
         <w:rPr>
-          <w:sz w:val="20"/>
+          <w:rFonts w:ascii="Calibri" w:hAnsi="Calibri" w:cs="Calibri" w:eastAsia="Calibri"/>
+          <w:i/>
+          <w:sz w:val="19"/>
         </w:rPr>
-        <w:t>Curitiba, PR – Brazil (Remote) · Jun 2022 – May 2024</w:t>
+        <w:t>Jun 2022 – May 2024</w:t>
       </w:r>
     </w:p>
     <w:p>
       <w:pPr>
         <w:pStyle w:val="ListBullet"/>
-        <w:spacing w:after="40"/>
-        <w:ind w:left="216"/>
+        <w:keepNext w:val="0"/>
+        <w:keepLines/>
+        <w:widowControl/>
+        <w:spacing w:before="0" w:after="20" w:lineRule="exact" w:line="240"/>
+        <w:ind w:left="255" w:hanging="142"/>
       </w:pPr>
       <w:r>
         <w:rPr>
-          <w:sz w:val="20"/>
+          <w:rFonts w:ascii="Calibri" w:hAnsi="Calibri" w:cs="Calibri" w:eastAsia="Calibri"/>
+          <w:sz w:val="19"/>
         </w:rPr>
         <w:t>Delivered end-to-end data projects across the fintech, agribusiness, and operations sectors by integrating high-volume payment providers (PagSeguro, Stone, Cielo), John Deere IoT APIs, and REST APIs.</w:t>
       </w:r>
@@ -533,58 +784,80 @@
     <w:p>
       <w:pPr>
         <w:pStyle w:val="ListBullet"/>
-        <w:spacing w:after="40"/>
-        <w:ind w:left="216"/>
+        <w:keepNext w:val="0"/>
+        <w:keepLines/>
+        <w:widowControl/>
+        <w:spacing w:before="0" w:after="20" w:lineRule="exact" w:line="240"/>
+        <w:ind w:left="255" w:hanging="142"/>
       </w:pPr>
       <w:r>
         <w:rPr>
-          <w:sz w:val="20"/>
+          <w:rFonts w:ascii="Calibri" w:hAnsi="Calibri" w:cs="Calibri" w:eastAsia="Calibri"/>
+          <w:sz w:val="19"/>
         </w:rPr>
-        <w:t>Designed dimensional Data Warehouses on SQL Server and Oracle Autonomous Database; automated complex ETL workflows with Airflow on Docker/Oracle Cloud to reduce recurring manual effort.</w:t>
+        <w:t>Designed dimensional Data Warehouses on SQL Server and Oracle Autonomous Database; automated complex ETL workflows with Airflow on Docker/Oracle Cloud to reduce manual effort by ~35%.</w:t>
       </w:r>
     </w:p>
     <w:p>
       <w:pPr>
         <w:pStyle w:val="ListBullet"/>
-        <w:spacing w:after="40"/>
-        <w:ind w:left="216"/>
+        <w:keepNext w:val="0"/>
+        <w:keepLines/>
+        <w:widowControl/>
+        <w:spacing w:before="0" w:after="20" w:lineRule="exact" w:line="240"/>
+        <w:ind w:left="255" w:hanging="142"/>
       </w:pPr>
       <w:r>
         <w:rPr>
-          <w:sz w:val="20"/>
+          <w:rFonts w:ascii="Calibri" w:hAnsi="Calibri" w:cs="Calibri" w:eastAsia="Calibri"/>
+          <w:sz w:val="19"/>
         </w:rPr>
         <w:t>Built dynamic Power BI dashboards to track critical KPIs, financial metrics, and operational performance for diverse client domains.</w:t>
       </w:r>
     </w:p>
     <w:p>
       <w:pPr>
-        <w:spacing w:before="120" w:after="40"/>
+        <w:keepNext/>
+        <w:keepLines/>
+        <w:widowControl/>
+        <w:tabs>
+          <w:tab w:pos="10318" w:val="right"/>
+        </w:tabs>
+        <w:spacing w:before="100" w:after="20" w:lineRule="exact" w:line="260"/>
       </w:pPr>
       <w:r>
         <w:rPr>
+          <w:rFonts w:ascii="Calibri" w:hAnsi="Calibri" w:cs="Calibri" w:eastAsia="Calibri"/>
           <w:b/>
           <w:sz w:val="21"/>
         </w:rPr>
-        <w:t>Data Analyst — Itaete Group</w:t>
+        <w:t>Data Analyst — Itaete Group | Curitiba, PR – Brazil (Hybrid)</w:t>
       </w:r>
-    </w:p>
-    <w:p>
+      <w:r>
+        <w:tab/>
+      </w:r>
       <w:r>
         <w:rPr>
-          <w:sz w:val="20"/>
+          <w:rFonts w:ascii="Calibri" w:hAnsi="Calibri" w:cs="Calibri" w:eastAsia="Calibri"/>
+          <w:i/>
+          <w:sz w:val="19"/>
         </w:rPr>
-        <w:t>Curitiba, PR – Brazil (Hybrid) · Jun 2020 – Feb 2023</w:t>
+        <w:t>Jun 2020 – Feb 2023</w:t>
       </w:r>
     </w:p>
     <w:p>
       <w:pPr>
         <w:pStyle w:val="ListBullet"/>
-        <w:spacing w:after="40"/>
-        <w:ind w:left="216"/>
+        <w:keepNext w:val="0"/>
+        <w:keepLines/>
+        <w:widowControl/>
+        <w:spacing w:before="0" w:after="20" w:lineRule="exact" w:line="240"/>
+        <w:ind w:left="255" w:hanging="142"/>
       </w:pPr>
       <w:r>
         <w:rPr>
-          <w:sz w:val="20"/>
+          <w:rFonts w:ascii="Calibri" w:hAnsi="Calibri" w:cs="Calibri" w:eastAsia="Calibri"/>
+          <w:sz w:val="19"/>
         </w:rPr>
         <w:t>Designed a SQL Server Data Warehouse and robust Python/SQL pipelines using Pandas to cleanse, transform, and enrich data from IoT devices, PostgreSQL, APIs, and CSV sources.</w:t>
       </w:r>
@@ -592,43 +865,58 @@
     <w:p>
       <w:pPr>
         <w:pStyle w:val="ListBullet"/>
-        <w:spacing w:after="40"/>
-        <w:ind w:left="216"/>
+        <w:keepNext w:val="0"/>
+        <w:keepLines/>
+        <w:widowControl/>
+        <w:spacing w:before="0" w:after="20" w:lineRule="exact" w:line="240"/>
+        <w:ind w:left="255" w:hanging="142"/>
       </w:pPr>
       <w:r>
         <w:rPr>
-          <w:sz w:val="20"/>
+          <w:rFonts w:ascii="Calibri" w:hAnsi="Calibri" w:cs="Calibri" w:eastAsia="Calibri"/>
+          <w:sz w:val="19"/>
         </w:rPr>
-        <w:t>Built Power BI dashboards and automated legacy Excel/VBA reporting workflows, shortening data processing time and reducing manual operational workloads.</w:t>
+        <w:t>Built Power BI dashboards and automated legacy Excel/VBA reporting workflows, slashing data processing time by ~50% and significantly reducing manual operational workloads.</w:t>
       </w:r>
     </w:p>
     <w:p>
       <w:pPr>
         <w:pStyle w:val="ListBullet"/>
-        <w:spacing w:after="40"/>
-        <w:ind w:left="216"/>
+        <w:keepNext w:val="0"/>
+        <w:keepLines/>
+        <w:widowControl/>
+        <w:spacing w:before="0" w:after="20" w:lineRule="exact" w:line="240"/>
+        <w:ind w:left="255" w:hanging="142"/>
       </w:pPr>
       <w:r>
         <w:rPr>
-          <w:sz w:val="20"/>
+          <w:rFonts w:ascii="Calibri" w:hAnsi="Calibri" w:cs="Calibri" w:eastAsia="Calibri"/>
+          <w:sz w:val="19"/>
         </w:rPr>
         <w:t>Developed internal systems for inventory management and financial automation, streamlining invoice generation and automated weekly report distribution.</w:t>
       </w:r>
     </w:p>
     <w:p>
       <w:pPr>
-        <w:spacing w:before="80" w:after="120"/>
+        <w:keepNext w:val="0"/>
+        <w:keepLines/>
+        <w:widowControl/>
+        <w:spacing w:before="80" w:after="40" w:lineRule="exact" w:line="80"/>
         <w:pBdr>
-          <w:bottom w:val="single" w:sz="6" w:space="1" w:color="CCCCCC"/>
+          <w:bottom w:val="single" w:sz="6" w:space="1" w:color="B0B0B0"/>
         </w:pBdr>
       </w:pPr>
     </w:p>
     <w:p>
       <w:pPr>
-        <w:spacing w:after="80"/>
+        <w:keepNext/>
+        <w:keepLines/>
+        <w:widowControl/>
+        <w:spacing w:before="40" w:after="60" w:lineRule="exact" w:line="280"/>
       </w:pPr>
       <w:r>
         <w:rPr>
+          <w:rFonts w:ascii="Calibri" w:hAnsi="Calibri" w:cs="Calibri" w:eastAsia="Calibri"/>
           <w:b/>
           <w:sz w:val="22"/>
         </w:rPr>
@@ -637,192 +925,165 @@
     </w:p>
     <w:p>
       <w:pPr>
-        <w:spacing w:before="120" w:after="40"/>
+        <w:keepNext/>
+        <w:keepLines/>
+        <w:widowControl/>
+        <w:spacing w:before="100" w:after="20" w:lineRule="exact" w:line="260"/>
       </w:pPr>
       <w:r>
         <w:rPr>
+          <w:rFonts w:ascii="Calibri" w:hAnsi="Calibri" w:cs="Calibri" w:eastAsia="Calibri"/>
           <w:b/>
           <w:sz w:val="21"/>
         </w:rPr>
-        <w:t>Omnichannel AI CRM Platform</w:t>
+        <w:t>OrbitAI — Omnichannel AI CRM</w:t>
       </w:r>
-    </w:p>
-    <w:p>
-      <w:pPr>
-        <w:spacing w:after="40"/>
-      </w:pPr>
       <w:r>
         <w:rPr>
+          <w:rFonts w:ascii="Calibri" w:hAnsi="Calibri" w:cs="Calibri" w:eastAsia="Calibri"/>
           <w:i/>
-          <w:sz w:val="19"/>
+          <w:sz w:val="18"/>
         </w:rPr>
-        <w:t>NestJS, Next.js, PostgreSQL, LLMs, Meta &amp; Google Ads APIs, Azure Container Apps, Docker · TK Technologies – Jun 2026 – Present</w:t>
+        <w:t xml:space="preserve">  ·  NestJS, Next.js, PostgreSQL, LLMs, Meta &amp; Google Ads APIs, Azure Container Apps, Docker  ·  TK Technologies – Jun 2026 – Present</w:t>
       </w:r>
     </w:p>
     <w:p>
       <w:pPr>
         <w:pStyle w:val="ListBullet"/>
-        <w:spacing w:after="40"/>
-        <w:ind w:left="216"/>
+        <w:keepNext w:val="0"/>
+        <w:keepLines/>
+        <w:widowControl/>
+        <w:spacing w:before="0" w:after="20" w:lineRule="exact" w:line="240"/>
+        <w:ind w:left="255" w:hanging="142"/>
       </w:pPr>
       <w:r>
         <w:rPr>
-          <w:sz w:val="20"/>
+          <w:rFonts w:ascii="Calibri" w:hAnsi="Calibri" w:cs="Calibri" w:eastAsia="Calibri"/>
+          <w:sz w:val="19"/>
         </w:rPr>
-        <w:t>Built a secure omnichannel CRM integrating WhatsApp, Instagram, Facebook, Telegram, and Email into a unified inbox with role-based access control (RBAC).</w:t>
+        <w:t>Built OrbitAI, a secure omnichannel CRM integrating WhatsApp, Instagram, Facebook, Telegram, and Email into a unified inbox with role-based access control (RBAC).</w:t>
       </w:r>
     </w:p>
     <w:p>
       <w:pPr>
         <w:pStyle w:val="ListBullet"/>
-        <w:spacing w:after="40"/>
-        <w:ind w:left="216"/>
+        <w:keepNext w:val="0"/>
+        <w:keepLines/>
+        <w:widowControl/>
+        <w:spacing w:before="0" w:after="20" w:lineRule="exact" w:line="240"/>
+        <w:ind w:left="255" w:hanging="142"/>
       </w:pPr>
       <w:r>
         <w:rPr>
-          <w:sz w:val="20"/>
+          <w:rFonts w:ascii="Calibri" w:hAnsi="Calibri" w:cs="Calibri" w:eastAsia="Calibri"/>
+          <w:sz w:val="19"/>
         </w:rPr>
-        <w:t>Connected Meta and Google Ads performance data to a unified marketing view.</w:t>
+        <w:t>Layered Meta/Google Ads performance data and LLMs (Claude/Google AI Studio) for auto-replies, outbound messaging assistance, and automated campaign analysis.</w:t>
+      </w:r>
+    </w:p>
+    <w:p>
+      <w:pPr>
+        <w:keepNext/>
+        <w:keepLines/>
+        <w:widowControl/>
+        <w:spacing w:before="100" w:after="20" w:lineRule="exact" w:line="260"/>
+      </w:pPr>
+      <w:r>
+        <w:rPr>
+          <w:rFonts w:ascii="Calibri" w:hAnsi="Calibri" w:cs="Calibri" w:eastAsia="Calibri"/>
+          <w:b/>
+          <w:sz w:val="21"/>
+        </w:rPr>
+        <w:t>Car Parts Price Searcher</w:t>
+      </w:r>
+      <w:r>
+        <w:rPr>
+          <w:rFonts w:ascii="Calibri" w:hAnsi="Calibri" w:cs="Calibri" w:eastAsia="Calibri"/>
+          <w:i/>
+          <w:sz w:val="18"/>
+        </w:rPr>
+        <w:t xml:space="preserve">  ·  Python, FastAPI, Celery, Playwright, Redis, PostgreSQL, n8n, Azure, Bicep  ·  TK Technologies – Feb 2026 – Present</w:t>
       </w:r>
     </w:p>
     <w:p>
       <w:pPr>
         <w:pStyle w:val="ListBullet"/>
-        <w:spacing w:after="40"/>
-        <w:ind w:left="216"/>
+        <w:keepNext w:val="0"/>
+        <w:keepLines/>
+        <w:widowControl/>
+        <w:spacing w:before="0" w:after="20" w:lineRule="exact" w:line="240"/>
+        <w:ind w:left="255" w:hanging="142"/>
       </w:pPr>
       <w:r>
         <w:rPr>
-          <w:sz w:val="20"/>
+          <w:rFonts w:ascii="Calibri" w:hAnsi="Calibri" w:cs="Calibri" w:eastAsia="Calibri"/>
+          <w:sz w:val="19"/>
         </w:rPr>
-        <w:t>Layered LLMs (Claude/Google AI Studio) for smart auto-replies, outbound messaging assistance, and automated ad campaign analysis; contribute to the related TK web presence and product maintenance using sanitized public descriptions.</w:t>
+        <w:t>Built a car-parts price searcher across 10+ sites, with parallel public-price and internal-stock lookup, auditable reporting, and notifications from containerised Azure services.</w:t>
       </w:r>
     </w:p>
     <w:p>
       <w:pPr>
-        <w:spacing w:before="120" w:after="40"/>
+        <w:keepNext/>
+        <w:keepLines/>
+        <w:widowControl/>
+        <w:spacing w:before="100" w:after="20" w:lineRule="exact" w:line="260"/>
       </w:pPr>
       <w:r>
         <w:rPr>
+          <w:rFonts w:ascii="Calibri" w:hAnsi="Calibri" w:cs="Calibri" w:eastAsia="Calibri"/>
           <w:b/>
           <w:sz w:val="21"/>
         </w:rPr>
-        <w:t>Automotive Market Price Intelligence Platform</w:t>
+        <w:t>IoT Data Lakehouse on AWS – Medallion Architecture</w:t>
       </w:r>
-    </w:p>
-    <w:p>
-      <w:pPr>
-        <w:spacing w:after="40"/>
-      </w:pPr>
       <w:r>
         <w:rPr>
+          <w:rFonts w:ascii="Calibri" w:hAnsi="Calibri" w:cs="Calibri" w:eastAsia="Calibri"/>
           <w:i/>
-          <w:sz w:val="19"/>
+          <w:sz w:val="18"/>
         </w:rPr>
-        <w:t>Python, n8n, LLMs, GCP APIs, Azure, Docker · TK Technologies – Feb 2026 – Present</w:t>
+        <w:t xml:space="preserve">  ·  AWS S3, Apache Spark, Delta Lake, Airflow, Trino, Apache Superset  ·  Client Project – Feb 2024</w:t>
       </w:r>
     </w:p>
     <w:p>
       <w:pPr>
         <w:pStyle w:val="ListBullet"/>
-        <w:spacing w:after="40"/>
-        <w:ind w:left="216"/>
+        <w:keepNext w:val="0"/>
+        <w:keepLines/>
+        <w:widowControl/>
+        <w:spacing w:before="0" w:after="20" w:lineRule="exact" w:line="240"/>
+        <w:ind w:left="255" w:hanging="142"/>
       </w:pPr>
       <w:r>
         <w:rPr>
-          <w:sz w:val="20"/>
-        </w:rPr>
-        <w:t>Built a dual-pipeline platform for public price research and internal stock lookup, using FastAPI/Celery/Playwright/Redis/PostgreSQL/n8n to deliver auditable reporting and notifications. Containerised services run on Azure with Bicep infrastructure-as-code.</w:t>
-      </w:r>
-    </w:p>
-    <w:p>
-      <w:pPr>
-        <w:spacing w:before="120" w:after="40"/>
-      </w:pPr>
-      <w:r>
-        <w:rPr>
-          <w:b/>
-          <w:sz w:val="21"/>
-        </w:rPr>
-        <w:t>IoT Data Lakehouse on AWS – Medallion Architecture</w:t>
-      </w:r>
-    </w:p>
-    <w:p>
-      <w:pPr>
-        <w:spacing w:after="40"/>
-      </w:pPr>
-      <w:r>
-        <w:rPr>
-          <w:i/>
+          <w:rFonts w:ascii="Calibri" w:hAnsi="Calibri" w:cs="Calibri" w:eastAsia="Calibri"/>
           <w:sz w:val="19"/>
-        </w:rPr>
-        <w:t>AWS S3, Apache Spark, Delta Lake, Airflow, Trino, Apache Superset · Client Project – Feb 2024</w:t>
-      </w:r>
-    </w:p>
-    <w:p>
-      <w:pPr>
-        <w:pStyle w:val="ListBullet"/>
-        <w:spacing w:after="40"/>
-        <w:ind w:left="216"/>
-      </w:pPr>
-      <w:r>
-        <w:rPr>
-          <w:sz w:val="20"/>
         </w:rPr>
         <w:t>Designed a Bronze/Silver/Gold lakehouse on AWS S3 ingesting from APIs and databases. Virtualised the Gold layer with Trino and surfaced governed datasets through BI dashboards.</w:t>
       </w:r>
     </w:p>
     <w:p>
       <w:pPr>
-        <w:spacing w:before="120" w:after="40"/>
-      </w:pPr>
-      <w:r>
-        <w:rPr>
-          <w:b/>
-          <w:sz w:val="21"/>
-        </w:rPr>
-        <w:t>AI Platform Engineering Portfolio (in progress — 2026)</w:t>
-      </w:r>
-    </w:p>
-    <w:p>
-      <w:pPr>
-        <w:spacing w:after="40"/>
-      </w:pPr>
-      <w:r>
-        <w:rPr>
-          <w:i/>
-          <w:sz w:val="19"/>
-        </w:rPr>
-        <w:t>FastAPI · PostgreSQL/pgvector · LangGraph · MCP · RAGAS · Docker · OpenTelemetry</w:t>
-      </w:r>
-    </w:p>
-    <w:p>
-      <w:pPr>
-        <w:pStyle w:val="ListBullet"/>
-        <w:spacing w:after="40"/>
-        <w:ind w:left="216"/>
-      </w:pPr>
-      <w:r>
-        <w:rPr>
-          <w:sz w:val="20"/>
-        </w:rPr>
-        <w:t>Building public, production-grade AI systems over enterprise data: RAG with hybrid retrieval and evaluation gates, LangGraph agent orchestration with human approval, MCP tool servers, and observability. Milestones shipping Jul–Dec 2026 on github.com/devzurc.</w:t>
-      </w:r>
-    </w:p>
-    <w:p>
-      <w:pPr>
-        <w:spacing w:before="80" w:after="120"/>
+        <w:keepNext w:val="0"/>
+        <w:keepLines/>
+        <w:widowControl/>
+        <w:spacing w:before="80" w:after="40" w:lineRule="exact" w:line="80"/>
         <w:pBdr>
-          <w:bottom w:val="single" w:sz="6" w:space="1" w:color="CCCCCC"/>
+          <w:bottom w:val="single" w:sz="6" w:space="1" w:color="B0B0B0"/>
         </w:pBdr>
       </w:pPr>
     </w:p>
     <w:p>
       <w:pPr>
-        <w:spacing w:after="80"/>
+        <w:keepNext/>
+        <w:keepLines/>
+        <w:widowControl/>
+        <w:spacing w:before="40" w:after="60" w:lineRule="exact" w:line="280"/>
       </w:pPr>
       <w:r>
         <w:rPr>
+          <w:rFonts w:ascii="Calibri" w:hAnsi="Calibri" w:cs="Calibri" w:eastAsia="Calibri"/>
           <w:b/>
           <w:sz w:val="22"/>
         </w:rPr>
@@ -830,8 +1091,15 @@
       </w:r>
     </w:p>
     <w:p>
+      <w:pPr>
+        <w:keepNext w:val="0"/>
+        <w:keepLines/>
+        <w:widowControl/>
+        <w:spacing w:before="80" w:after="20" w:lineRule="exact" w:line="260"/>
+      </w:pPr>
       <w:r>
         <w:rPr>
+          <w:rFonts w:ascii="Calibri" w:hAnsi="Calibri" w:cs="Calibri" w:eastAsia="Calibri"/>
           <w:b/>
           <w:sz w:val="20"/>
         </w:rPr>
@@ -839,8 +1107,15 @@
       </w:r>
     </w:p>
     <w:p>
+      <w:pPr>
+        <w:keepNext w:val="0"/>
+        <w:keepLines/>
+        <w:widowControl/>
+        <w:spacing w:before="0" w:after="20" w:lineRule="exact" w:line="250"/>
+      </w:pPr>
       <w:r>
         <w:rPr>
+          <w:rFonts w:ascii="Calibri" w:hAnsi="Calibri" w:cs="Calibri" w:eastAsia="Calibri"/>
           <w:sz w:val="20"/>
         </w:rPr>
         <w:t>Majors: Information Systems · Business Analytics · Data Analysis · Database Systems · Software Engineering</w:t>
@@ -848,18 +1123,25 @@
     </w:p>
     <w:p>
       <w:pPr>
-        <w:spacing w:before="80" w:after="120"/>
+        <w:keepNext w:val="0"/>
+        <w:keepLines/>
+        <w:widowControl/>
+        <w:spacing w:before="80" w:after="40" w:lineRule="exact" w:line="80"/>
         <w:pBdr>
-          <w:bottom w:val="single" w:sz="6" w:space="1" w:color="CCCCCC"/>
+          <w:bottom w:val="single" w:sz="6" w:space="1" w:color="B0B0B0"/>
         </w:pBdr>
       </w:pPr>
     </w:p>
     <w:p>
       <w:pPr>
-        <w:spacing w:after="80"/>
+        <w:keepNext/>
+        <w:keepLines/>
+        <w:widowControl/>
+        <w:spacing w:before="40" w:after="60" w:lineRule="exact" w:line="280"/>
       </w:pPr>
       <w:r>
         <w:rPr>
+          <w:rFonts w:ascii="Calibri" w:hAnsi="Calibri" w:cs="Calibri" w:eastAsia="Calibri"/>
           <w:b/>
           <w:sz w:val="22"/>
         </w:rPr>
@@ -869,12 +1151,16 @@
     <w:p>
       <w:pPr>
         <w:pStyle w:val="ListBullet"/>
-        <w:spacing w:after="40"/>
-        <w:ind w:left="216"/>
+        <w:keepNext w:val="0"/>
+        <w:keepLines/>
+        <w:widowControl/>
+        <w:spacing w:before="0" w:after="20" w:lineRule="exact" w:line="240"/>
+        <w:ind w:left="255" w:hanging="142"/>
       </w:pPr>
       <w:r>
         <w:rPr>
-          <w:sz w:val="20"/>
+          <w:rFonts w:ascii="Calibri" w:hAnsi="Calibri" w:cs="Calibri" w:eastAsia="Calibri"/>
+          <w:sz w:val="19"/>
         </w:rPr>
         <w:t>AI for Writing and Communicating — Google (Credential ID: HE8YE5IS7WVW) · Jul 2026</w:t>
       </w:r>
@@ -882,12 +1168,16 @@
     <w:p>
       <w:pPr>
         <w:pStyle w:val="ListBullet"/>
-        <w:spacing w:after="40"/>
-        <w:ind w:left="216"/>
+        <w:keepNext w:val="0"/>
+        <w:keepLines/>
+        <w:widowControl/>
+        <w:spacing w:before="0" w:after="20" w:lineRule="exact" w:line="240"/>
+        <w:ind w:left="255" w:hanging="142"/>
       </w:pPr>
       <w:r>
         <w:rPr>
-          <w:sz w:val="20"/>
+          <w:rFonts w:ascii="Calibri" w:hAnsi="Calibri" w:cs="Calibri" w:eastAsia="Calibri"/>
+          <w:sz w:val="19"/>
         </w:rPr>
         <w:t>AI for Research and Insights — Google (Credential ID: 4PZDF3XQOF55) · Jul 2026</w:t>
       </w:r>
@@ -895,12 +1185,16 @@
     <w:p>
       <w:pPr>
         <w:pStyle w:val="ListBullet"/>
-        <w:spacing w:after="40"/>
-        <w:ind w:left="216"/>
+        <w:keepNext w:val="0"/>
+        <w:keepLines/>
+        <w:widowControl/>
+        <w:spacing w:before="0" w:after="20" w:lineRule="exact" w:line="240"/>
+        <w:ind w:left="255" w:hanging="142"/>
       </w:pPr>
       <w:r>
         <w:rPr>
-          <w:sz w:val="20"/>
+          <w:rFonts w:ascii="Calibri" w:hAnsi="Calibri" w:cs="Calibri" w:eastAsia="Calibri"/>
+          <w:sz w:val="19"/>
         </w:rPr>
         <w:t>AI for Brainstorming and Planning — Google (Credential ID: 7SFW2HGOKIU5) · Jul 2026</w:t>
       </w:r>
@@ -908,19 +1202,23 @@
     <w:p>
       <w:pPr>
         <w:pStyle w:val="ListBullet"/>
-        <w:spacing w:after="40"/>
-        <w:ind w:left="216"/>
+        <w:keepNext w:val="0"/>
+        <w:keepLines/>
+        <w:widowControl/>
+        <w:spacing w:before="0" w:after="20" w:lineRule="exact" w:line="240"/>
+        <w:ind w:left="255" w:hanging="142"/>
       </w:pPr>
       <w:r>
         <w:rPr>
-          <w:sz w:val="20"/>
+          <w:rFonts w:ascii="Calibri" w:hAnsi="Calibri" w:cs="Calibri" w:eastAsia="Calibri"/>
+          <w:sz w:val="19"/>
         </w:rPr>
         <w:t>AI Fundamentals — Google (Credential ID: UKBGM0AZUIS2) · Jul 2026</w:t>
       </w:r>
     </w:p>
     <w:sectPr>
-      <w:pgSz w:w="12240" w:h="15840"/>
-      <w:pgMar w:top="720" w:right="864" w:bottom="720" w:left="864" w:header="720" w:footer="720" w:gutter="0"/>
+      <w:pgSz w:w="11906" w:h="16838"/>
+      <w:pgMar w:top="652" w:right="794" w:bottom="652" w:left="794" w:header="720" w:footer="720" w:gutter="0"/>
       <w:cols w:space="720"/>
       <w:docGrid w:linePitch="360"/>
     </w:sectPr>
@@ -1291,8 +1589,11 @@
     <w:name w:val="Normal"/>
     <w:qFormat/>
     <w:rsid w:val="00FC693F"/>
+    <w:pPr>
+      <w:spacing w:before="0" w:after="0" w:line="240" w:lineRule="auto"/>
+    </w:pPr>
     <w:rPr>
-      <w:rFonts w:ascii="Calibri" w:hAnsi="Calibri"/>
+      <w:rFonts w:ascii="Calibri" w:hAnsi="Calibri" w:cs="Calibri" w:eastAsia="Calibri"/>
       <w:sz w:val="20"/>
     </w:rPr>
   </w:style>

</xml_diff>

<commit_message>
feat(cv): sync resume 2026-10-14
Align the portfolio and resume exports with the October CV, and drop the phone number plus the 173tech application drafts.

Co-authored-by: Cursor <cursoragent@cursor.com>
</commit_message>
<xml_diff>
--- a/docs/resume/word/LucasCruz_CV_EN.docx
+++ b/docs/resume/word/LucasCruz_CV_EN.docx
@@ -33,7 +33,7 @@
           <w:b/>
           <w:sz w:val="22"/>
         </w:rPr>
-        <w:t>Senior Data Engineer | Gen. AI Automation Engineer</w:t>
+        <w:t>AI Engineer / Senior Data Engineer</w:t>
       </w:r>
     </w:p>
     <w:p>
@@ -49,7 +49,7 @@
           <w:rFonts w:ascii="Calibri" w:hAnsi="Calibri" w:cs="Calibri" w:eastAsia="Calibri"/>
           <w:sz w:val="19"/>
         </w:rPr>
-        <w:t>+55 (21) 96552-9308 · dev.lucascruz@gmail.com · linkedin.com/in/lucas-cruz · devzurc.github.io/portfolio</w:t>
+        <w:t>dev.lucascruz@gmail.com · linkedin.com/in/lucas-cruz · devzurc.github.io/portfolio</w:t>
       </w:r>
     </w:p>
     <w:p>
@@ -65,7 +65,7 @@
           <w:rFonts w:ascii="Calibri" w:hAnsi="Calibri" w:cs="Calibri" w:eastAsia="Calibri"/>
           <w:sz w:val="19"/>
         </w:rPr>
-        <w:t>Florianópolis, Santa Catarina, Brazil · Requires visa sponsorship</w:t>
+        <w:t>Curitiba, Paraná, Brazil</w:t>
       </w:r>
     </w:p>
     <w:p>
@@ -107,7 +107,7 @@
           <w:rFonts w:ascii="Calibri" w:hAnsi="Calibri" w:cs="Calibri" w:eastAsia="Calibri"/>
           <w:sz w:val="20"/>
         </w:rPr>
-        <w:t>I build production data pipelines, cloud lakehouses, and LLM/n8n workflows across IoT, fintech, agribusiness, and automotive products, with 5+ years in data roles and English at C1. I am learning production RAG, evaluation, and observability. Those are not shipped systems yet.</w:t>
+        <w:t>AI engineer and senior data engineer with ~5 years in data engineering, building on earlier data-analyst experience, working across frontend, full-stack, backend, and AI automation. At TK Technologies, designed and built an automotive-parts pricing and stock data platform (async Python, n8n, Azure) and built frontend and full-stack features for a multi-model generative-AI chat platform (React, TypeScript, Tailwind). Previously built Python/SQL pipelines, Airflow-orchestrated ETL, data warehouses, and AWS lakehouses (Medallion, Delta Lake, Trino) for IoT, fintech, and agribusiness, handling LGPD/GDPR-governed data. Personal projects include a multi-tenant CRM with AI draft replies (FastAPI, Next.js, PostgreSQL), a local-first lakehouse (Prefect, dbt Core, DuckDB), and production RAG with pgvector (in progress). English: IELTS B2 (2025), self-assessed near C1.</w:t>
       </w:r>
     </w:p>
     <w:p>
@@ -180,7 +180,7 @@
                 <w:b/>
                 <w:sz w:val="18"/>
               </w:rPr>
-              <w:t>Gen. AI &amp; automation</w:t>
+              <w:t>AI data &amp; LLM apps</w:t>
             </w:r>
           </w:p>
         </w:tc>
@@ -201,7 +201,7 @@
                 <w:rFonts w:ascii="Calibri" w:hAnsi="Calibri" w:cs="Calibri" w:eastAsia="Calibri"/>
                 <w:sz w:val="18"/>
               </w:rPr>
-              <w:t>LLM integration (Claude, Google AI Studio), n8n, prompt design, chatbots, Meta Cloud API</w:t>
+              <w:t>LLM integration (Claude, Google AI Studio), AI automation, AI coding agents, conversational data querying, n8n, prompt design, chatbots, Meta Cloud API</w:t>
             </w:r>
           </w:p>
         </w:tc>
@@ -246,7 +246,52 @@
                 <w:rFonts w:ascii="Calibri" w:hAnsi="Calibri" w:cs="Calibri" w:eastAsia="Calibri"/>
                 <w:sz w:val="18"/>
               </w:rPr>
-              <w:t>Python, SQL, Apache Spark (PySpark), Pandas, Airflow, Delta Lake, Parquet, Trino, Playwright, web scraping</w:t>
+              <w:t>Python, SQL, Pandas, Apache Spark (PySpark), Airflow, ETL/ELT, dimensional modelling, Delta Lake, Parquet, Trino, REST API ingestion, JSON Schema contracts, webhooks, Playwright, web scraping</w:t>
+            </w:r>
+          </w:p>
+        </w:tc>
+      </w:tr>
+      <w:tr>
+        <w:tc>
+          <w:tcPr>
+            <w:tcW w:type="dxa" w:w="3198"/>
+          </w:tcPr>
+          <w:p>
+            <w:pPr>
+              <w:keepNext w:val="0"/>
+              <w:keepLines/>
+              <w:widowControl/>
+              <w:spacing w:before="20" w:after="20" w:lineRule="exact" w:line="240"/>
+            </w:pPr>
+            <w:r/>
+            <w:r>
+              <w:rPr>
+                <w:rFonts w:ascii="Calibri" w:hAnsi="Calibri" w:cs="Calibri" w:eastAsia="Calibri"/>
+                <w:b/>
+                <w:sz w:val="18"/>
+              </w:rPr>
+              <w:t>Frontend &amp; full-stack</w:t>
+            </w:r>
+          </w:p>
+        </w:tc>
+        <w:tc>
+          <w:tcPr>
+            <w:tcW w:type="dxa" w:w="7120"/>
+          </w:tcPr>
+          <w:p>
+            <w:pPr>
+              <w:keepNext w:val="0"/>
+              <w:keepLines/>
+              <w:widowControl/>
+              <w:spacing w:before="20" w:after="20" w:lineRule="exact" w:line="240"/>
+            </w:pPr>
+            <w:r/>
+            <w:r>
+              <w:rPr>
+                <w:rFonts w:ascii="Calibri" w:hAnsi="Calibri" w:cs="Calibri" w:eastAsia="Calibri"/>
+                <w:sz w:val="18"/>
+              </w:rPr>
+              <w:t>React 18, TypeScript, Vite, Tailwind CSS, Figma-to-UI, Next.js, NestJS, FastAPI</w:t>
             </w:r>
           </w:p>
         </w:tc>
@@ -291,7 +336,7 @@
                 <w:rFonts w:ascii="Calibri" w:hAnsi="Calibri" w:cs="Calibri" w:eastAsia="Calibri"/>
                 <w:sz w:val="18"/>
               </w:rPr>
-              <w:t>AWS, Azure, GCP, OCI, Docker, Azure Container Apps, Bicep, FastAPI, NestJS, Next.js, Celery, Redis, Git, CI/CD</w:t>
+              <w:t>AWS, Azure, GCP, OCI, Docker, Azure Container Apps, Azure App Service, Bicep, Celery, Redis Streams, n8n, Git, GitHub Actions CI/CD</w:t>
             </w:r>
           </w:p>
         </w:tc>
@@ -426,7 +471,7 @@
                 <w:rFonts w:ascii="Calibri" w:hAnsi="Calibri" w:cs="Calibri" w:eastAsia="Calibri"/>
                 <w:sz w:val="18"/>
               </w:rPr>
-              <w:t>dbt Core, Prefect, DuckDB, Snowflake</w:t>
+              <w:t>dbt Core, Prefect, DuckDB, Snowflake, pgvector/RAG (in progress)</w:t>
             </w:r>
           </w:p>
         </w:tc>
@@ -471,7 +516,7 @@
                 <w:rFonts w:ascii="Calibri" w:hAnsi="Calibri" w:cs="Calibri" w:eastAsia="Calibri"/>
                 <w:sz w:val="18"/>
               </w:rPr>
-              <w:t>Portuguese (Native) · English (C1 – Advanced) · Spanish (B1 – Intermediate)</w:t>
+              <w:t>Portuguese (Native) · English (IELTS B2 (2025), self-assessed near C1) · Spanish (B1 – Intermediate)</w:t>
             </w:r>
           </w:p>
         </w:tc>
@@ -520,7 +565,7 @@
           <w:b/>
           <w:sz w:val="21"/>
         </w:rPr>
-        <w:t>Gen. AI Engineer — TK Technologies | Curitiba, PR – Brazil (Hybrid)</w:t>
+        <w:t>Gen AI Engineer (AI Data &amp; Full-Stack Engineering) — TK Technologies | Curitiba, PR – Brazil (Hybrid)</w:t>
       </w:r>
       <w:r>
         <w:tab/>
@@ -548,7 +593,7 @@
           <w:rFonts w:ascii="Calibri" w:hAnsi="Calibri" w:cs="Calibri" w:eastAsia="Calibri"/>
           <w:sz w:val="19"/>
         </w:rPr>
-        <w:t>Built OrbitAI, an omnichannel AI CRM (WhatsApp, Instagram, Facebook, Telegram, and email) with role-based access, Meta/Google Ads tracking, and LLM replies, deployed on Azure Container Apps with Bicep.</w:t>
+        <w:t>Designed and built, nearly alone, an automotive-parts pricing and stock data platform that takes SKU requests from chat, email, schedules, and spreadsheets and runs web scraping and internal inventory lookups in parallel.</w:t>
       </w:r>
     </w:p>
     <w:p>
@@ -565,7 +610,7 @@
           <w:rFonts w:ascii="Calibri" w:hAnsi="Calibri" w:cs="Calibri" w:eastAsia="Calibri"/>
           <w:sz w:val="19"/>
         </w:rPr>
-        <w:t>Engineered a multi-source web scraping pipeline in Python targeting 10+ automotive parts websites, extracting pricing and product metadata at scale to deliver competitive market intelligence.</w:t>
+        <w:t>Built async Python services (FastAPI, Celery, Redis Streams, Playwright) with caching, JSON Schema contracts, and webhook callbacks, orchestrated with n8n.</w:t>
       </w:r>
     </w:p>
     <w:p>
@@ -582,7 +627,7 @@
           <w:rFonts w:ascii="Calibri" w:hAnsi="Calibri" w:cs="Calibri" w:eastAsia="Calibri"/>
           <w:sz w:val="19"/>
         </w:rPr>
-        <w:t>Built n8n workflows for ETL, chat, messaging intake, and operational follow-up, using LLMs (Claude, Google AI Studio) and GCP APIs (Sheets, Drive).</w:t>
+        <w:t>Deployed separate dev and prod environments on Azure with Bicep IaC, containers, and GitHub Actions CI/CD, adding health checks, outage guardrails, quotas, and access control.</w:t>
       </w:r>
     </w:p>
     <w:p>
@@ -599,7 +644,7 @@
           <w:rFonts w:ascii="Calibri" w:hAnsi="Calibri" w:cs="Calibri" w:eastAsia="Calibri"/>
           <w:sz w:val="19"/>
         </w:rPr>
-        <w:t>Developed a conversational AI chatbot that empowers business users to query and refine pricing datasets via natural language, reducing time-to-insight for non-technical stakeholders.</w:t>
+        <w:t>Delivered automated spreadsheet reporting and dashboards with clear outcome statuses and Telegram/email notifications, using AI coding agents throughout.</w:t>
       </w:r>
     </w:p>
     <w:p>
@@ -616,7 +661,99 @@
           <w:rFonts w:ascii="Calibri" w:hAnsi="Calibri" w:cs="Calibri" w:eastAsia="Calibri"/>
           <w:sz w:val="19"/>
         </w:rPr>
-        <w:t>Coordinated Notion-based delivery sprints, customer-facing demos, product training, sales support, and post-launch support; contribute to the TK web presence and ongoing CRM product development and maintenance.</w:t>
+        <w:t>Built a full-stack web workspace for the automotive-parts pricing platform: a React + TypeScript + Vite + Tailwind frontend with chat-based SKU lookups, results tables and an executive analytics dashboard (KPIs, catalog, site coverage, SKU benchmarking), tested with Vitest.</w:t>
+      </w:r>
+    </w:p>
+    <w:p>
+      <w:pPr>
+        <w:pStyle w:val="ListBullet"/>
+        <w:keepNext w:val="0"/>
+        <w:keepLines/>
+        <w:widowControl/>
+        <w:spacing w:before="0" w:after="20" w:lineRule="exact" w:line="240"/>
+        <w:ind w:left="255" w:hanging="142"/>
+      </w:pPr>
+      <w:r>
+        <w:rPr>
+          <w:rFonts w:ascii="Calibri" w:hAnsi="Calibri" w:cs="Calibri" w:eastAsia="Calibri"/>
+          <w:sz w:val="19"/>
+        </w:rPr>
+        <w:t>Designed the FastAPI/Postgres backend behind it: authentication, per-tenant data isolation, an append-only audit log, and a two-stage (raw-to-cleaned) data pipeline that turns scraper and inventory results into certified metrics.</w:t>
+      </w:r>
+    </w:p>
+    <w:p>
+      <w:pPr>
+        <w:pStyle w:val="ListBullet"/>
+        <w:keepNext w:val="0"/>
+        <w:keepLines/>
+        <w:widowControl/>
+        <w:spacing w:before="0" w:after="20" w:lineRule="exact" w:line="240"/>
+        <w:ind w:left="255" w:hanging="142"/>
+      </w:pPr>
+      <w:r>
+        <w:rPr>
+          <w:rFonts w:ascii="Calibri" w:hAnsi="Calibri" w:cs="Calibri" w:eastAsia="Calibri"/>
+          <w:sz w:val="19"/>
+        </w:rPr>
+        <w:t>Built frontend and full-stack features for a multi-model generative-AI chat platform in React 18, TypeScript, Vite, and Tailwind CSS: ~17 Figma-designed screens and ~6 chat input features (image generation, deep research, artifacts, file attachments, audio input), with 12 merged PRs in ~4 weeks as implementer under tech-lead review.</w:t>
+      </w:r>
+    </w:p>
+    <w:p>
+      <w:pPr>
+        <w:pStyle w:val="ListBullet"/>
+        <w:keepNext w:val="0"/>
+        <w:keepLines/>
+        <w:widowControl/>
+        <w:spacing w:before="0" w:after="20" w:lineRule="exact" w:line="240"/>
+        <w:ind w:left="255" w:hanging="142"/>
+      </w:pPr>
+      <w:r>
+        <w:rPr>
+          <w:rFonts w:ascii="Calibri" w:hAnsi="Calibri" w:cs="Calibri" w:eastAsia="Calibri"/>
+          <w:sz w:val="19"/>
+        </w:rPr>
+        <w:t>Delivered through Jira-tracked tasks, conventional commits, QA and visual regression evidence, and review-gated merges, with GitHub Actions CI/CD to Azure App Service.</w:t>
+      </w:r>
+    </w:p>
+    <w:p>
+      <w:pPr>
+        <w:keepNext/>
+        <w:keepLines/>
+        <w:widowControl/>
+        <w:spacing w:before="100" w:after="20" w:lineRule="exact" w:line="260"/>
+      </w:pPr>
+      <w:r>
+        <w:rPr>
+          <w:rFonts w:ascii="Calibri" w:hAnsi="Calibri" w:cs="Calibri" w:eastAsia="Calibri"/>
+          <w:b/>
+          <w:sz w:val="21"/>
+        </w:rPr>
+        <w:t>Career break</w:t>
+      </w:r>
+      <w:r>
+        <w:rPr>
+          <w:rFonts w:ascii="Calibri" w:hAnsi="Calibri" w:cs="Calibri" w:eastAsia="Calibri"/>
+          <w:i/>
+          <w:sz w:val="18"/>
+        </w:rPr>
+        <w:t xml:space="preserve">  ·  Oct 2024 – Oct 2025</w:t>
+      </w:r>
+    </w:p>
+    <w:p>
+      <w:pPr>
+        <w:pStyle w:val="ListBullet"/>
+        <w:keepNext w:val="0"/>
+        <w:keepLines/>
+        <w:widowControl/>
+        <w:spacing w:before="0" w:after="20" w:lineRule="exact" w:line="240"/>
+        <w:ind w:left="255" w:hanging="142"/>
+      </w:pPr>
+      <w:r>
+        <w:rPr>
+          <w:rFonts w:ascii="Calibri" w:hAnsi="Calibri" w:cs="Calibri" w:eastAsia="Calibri"/>
+          <w:sz w:val="19"/>
+        </w:rPr>
+        <w:t>English exchange in London, UK (daily immersion, IELTS B2) and upskilling studies, incl. IBM Introduction to Data Engineering.</w:t>
       </w:r>
     </w:p>
     <w:p>
@@ -936,7 +1073,7 @@
           <w:b/>
           <w:sz w:val="21"/>
         </w:rPr>
-        <w:t>OrbitAI — Omnichannel AI CRM</w:t>
+        <w:t>Omnichannel AI Platform (private)</w:t>
       </w:r>
       <w:r>
         <w:rPr>
@@ -961,7 +1098,7 @@
           <w:rFonts w:ascii="Calibri" w:hAnsi="Calibri" w:cs="Calibri" w:eastAsia="Calibri"/>
           <w:sz w:val="19"/>
         </w:rPr>
-        <w:t>Built OrbitAI, a secure omnichannel CRM integrating WhatsApp, Instagram, Facebook, Telegram, and Email into a unified inbox with role-based access control (RBAC).</w:t>
+        <w:t>Built a secure omnichannel CRM integrating WhatsApp, Instagram, Facebook, Telegram, and Email into a unified inbox with role-based access control (RBAC).</w:t>
       </w:r>
     </w:p>
     <w:p>
@@ -994,7 +1131,7 @@
           <w:b/>
           <w:sz w:val="21"/>
         </w:rPr>
-        <w:t>Car Parts Price Searcher</w:t>
+        <w:t>Automotive Parts Price Search (private)</w:t>
       </w:r>
       <w:r>
         <w:rPr>
@@ -1162,7 +1299,7 @@
           <w:rFonts w:ascii="Calibri" w:hAnsi="Calibri" w:cs="Calibri" w:eastAsia="Calibri"/>
           <w:sz w:val="19"/>
         </w:rPr>
-        <w:t>IELTS General — English C1</w:t>
+        <w:t>IELTS General — IELTS B2 (band 5.5, Sep 2025)</w:t>
       </w:r>
     </w:p>
     <w:p>
@@ -1231,6 +1368,74 @@
           <w:sz w:val="19"/>
         </w:rPr>
         <w:t>AI Fundamentals — Google (Credential ID: UKBGM0AZUIS2) · Jul 2026</w:t>
+      </w:r>
+    </w:p>
+    <w:p>
+      <w:pPr>
+        <w:pStyle w:val="ListBullet"/>
+        <w:keepNext w:val="0"/>
+        <w:keepLines/>
+        <w:widowControl/>
+        <w:spacing w:before="0" w:after="20" w:lineRule="exact" w:line="240"/>
+        <w:ind w:left="255" w:hanging="142"/>
+      </w:pPr>
+      <w:r>
+        <w:rPr>
+          <w:rFonts w:ascii="Calibri" w:hAnsi="Calibri" w:cs="Calibri" w:eastAsia="Calibri"/>
+          <w:sz w:val="19"/>
+        </w:rPr>
+        <w:t>Introduction to Data Engineering — IBM · Jan 2025</w:t>
+      </w:r>
+    </w:p>
+    <w:p>
+      <w:pPr>
+        <w:pStyle w:val="ListBullet"/>
+        <w:keepNext w:val="0"/>
+        <w:keepLines/>
+        <w:widowControl/>
+        <w:spacing w:before="0" w:after="20" w:lineRule="exact" w:line="240"/>
+        <w:ind w:left="255" w:hanging="142"/>
+      </w:pPr>
+      <w:r>
+        <w:rPr>
+          <w:rFonts w:ascii="Calibri" w:hAnsi="Calibri" w:cs="Calibri" w:eastAsia="Calibri"/>
+          <w:sz w:val="19"/>
+        </w:rPr>
+        <w:t>Docker Essentials — LINUXtips · Jun 2024</w:t>
+      </w:r>
+    </w:p>
+    <w:p>
+      <w:pPr>
+        <w:pStyle w:val="ListBullet"/>
+        <w:keepNext w:val="0"/>
+        <w:keepLines/>
+        <w:widowControl/>
+        <w:spacing w:before="0" w:after="20" w:lineRule="exact" w:line="240"/>
+        <w:ind w:left="255" w:hanging="142"/>
+      </w:pPr>
+      <w:r>
+        <w:rPr>
+          <w:rFonts w:ascii="Calibri" w:hAnsi="Calibri" w:cs="Calibri" w:eastAsia="Calibri"/>
+          <w:sz w:val="19"/>
+        </w:rPr>
+        <w:t>AWS Cloud Practitioner Essentials — AWS (Coursera) · Apr 2024</w:t>
+      </w:r>
+    </w:p>
+    <w:p>
+      <w:pPr>
+        <w:pStyle w:val="ListBullet"/>
+        <w:keepNext w:val="0"/>
+        <w:keepLines/>
+        <w:widowControl/>
+        <w:spacing w:before="0" w:after="20" w:lineRule="exact" w:line="240"/>
+        <w:ind w:left="255" w:hanging="142"/>
+      </w:pPr>
+      <w:r>
+        <w:rPr>
+          <w:rFonts w:ascii="Calibri" w:hAnsi="Calibri" w:cs="Calibri" w:eastAsia="Calibri"/>
+          <w:sz w:val="19"/>
+        </w:rPr>
+        <w:t>AWS Discovery Day — Ka Solution · Feb 2024</w:t>
       </w:r>
     </w:p>
     <w:sectPr>

</xml_diff>

<commit_message>
ZUR-12: Publish phone-free CV v2 (EN) and drop outdated PT PDF
</commit_message>
<xml_diff>
--- a/docs/resume/word/LucasCruz_CV_EN.docx
+++ b/docs/resume/word/LucasCruz_CV_EN.docx
@@ -4,33 +4,27 @@
   <w:body>
     <w:p>
       <w:pPr>
-        <w:keepNext w:val="0"/>
-        <w:keepLines/>
-        <w:widowControl/>
-        <w:spacing w:before="0" w:after="20" w:lineRule="exact" w:line="440"/>
+        <w:spacing w:after="0" w:before="0"/>
         <w:jc w:val="center"/>
       </w:pPr>
       <w:r>
         <w:rPr>
-          <w:rFonts w:ascii="Calibri" w:hAnsi="Calibri" w:cs="Calibri" w:eastAsia="Calibri"/>
           <w:b/>
+          <w:i w:val="0"/>
           <w:sz w:val="36"/>
         </w:rPr>
-        <w:t>LUCAS CRUZ</w:t>
+        <w:t>LUCAS FELIPE CRUZ</w:t>
       </w:r>
     </w:p>
     <w:p>
       <w:pPr>
-        <w:keepNext w:val="0"/>
-        <w:keepLines/>
-        <w:widowControl/>
-        <w:spacing w:before="0" w:after="20" w:lineRule="exact" w:line="280"/>
+        <w:spacing w:after="40" w:before="0"/>
         <w:jc w:val="center"/>
       </w:pPr>
       <w:r>
         <w:rPr>
-          <w:rFonts w:ascii="Calibri" w:hAnsi="Calibri" w:cs="Calibri" w:eastAsia="Calibri"/>
           <w:b/>
+          <w:i w:val="0"/>
           <w:sz w:val="22"/>
         </w:rPr>
         <w:t>AI Engineer / Senior Data Engineer</w:t>
@@ -38,1249 +32,706 @@
     </w:p>
     <w:p>
       <w:pPr>
-        <w:keepNext w:val="0"/>
-        <w:keepLines/>
-        <w:widowControl/>
-        <w:spacing w:before="0" w:after="20" w:lineRule="exact" w:line="250"/>
+        <w:spacing w:after="0" w:before="0"/>
         <w:jc w:val="center"/>
       </w:pPr>
       <w:r>
         <w:rPr>
-          <w:rFonts w:ascii="Calibri" w:hAnsi="Calibri" w:cs="Calibri" w:eastAsia="Calibri"/>
-          <w:sz w:val="19"/>
+          <w:b w:val="0"/>
+          <w:i w:val="0"/>
         </w:rPr>
         <w:t>dev.lucascruz@gmail.com · linkedin.com/in/lucas-cruz · devzurc.github.io/portfolio</w:t>
       </w:r>
     </w:p>
     <w:p>
       <w:pPr>
-        <w:keepNext w:val="0"/>
-        <w:keepLines/>
-        <w:widowControl/>
-        <w:spacing w:before="0" w:after="20" w:lineRule="exact" w:line="250"/>
+        <w:spacing w:after="0" w:before="0"/>
         <w:jc w:val="center"/>
       </w:pPr>
       <w:r>
         <w:rPr>
-          <w:rFonts w:ascii="Calibri" w:hAnsi="Calibri" w:cs="Calibri" w:eastAsia="Calibri"/>
-          <w:sz w:val="19"/>
+          <w:b w:val="0"/>
+          <w:i w:val="0"/>
         </w:rPr>
-        <w:t>Curitiba, Paraná, Brazil</w:t>
+        <w:t>Curitiba, Paraná, Brazil · Brazilian citizen · Available immediately</w:t>
       </w:r>
     </w:p>
     <w:p>
       <w:pPr>
-        <w:keepNext w:val="0"/>
-        <w:keepLines/>
-        <w:widowControl/>
-        <w:spacing w:before="80" w:after="40" w:lineRule="exact" w:line="80"/>
+        <w:spacing w:after="40" w:before="140"/>
         <w:pBdr>
-          <w:bottom w:val="single" w:sz="6" w:space="1" w:color="B0B0B0"/>
+          <w:bottom w:val="single" w:sz="6" w:space="1" w:color="444444"/>
         </w:pBdr>
-      </w:pPr>
-    </w:p>
-    <w:p>
-      <w:pPr>
-        <w:keepNext/>
-        <w:keepLines/>
-        <w:widowControl/>
-        <w:spacing w:before="40" w:after="60" w:lineRule="exact" w:line="280"/>
       </w:pPr>
       <w:r>
         <w:rPr>
-          <w:rFonts w:ascii="Calibri" w:hAnsi="Calibri" w:cs="Calibri" w:eastAsia="Calibri"/>
           <w:b/>
-          <w:sz w:val="22"/>
+          <w:i w:val="0"/>
+          <w:sz w:val="21"/>
         </w:rPr>
         <w:t>PROFESSIONAL SUMMARY</w:t>
       </w:r>
     </w:p>
     <w:p>
       <w:pPr>
-        <w:keepNext w:val="0"/>
-        <w:keepLines/>
-        <w:widowControl/>
-        <w:spacing w:before="0" w:after="20" w:lineRule="exact" w:line="250"/>
+        <w:spacing w:after="0" w:before="0"/>
       </w:pPr>
       <w:r>
         <w:rPr>
-          <w:rFonts w:ascii="Calibri" w:hAnsi="Calibri" w:cs="Calibri" w:eastAsia="Calibri"/>
-          <w:sz w:val="20"/>
+          <w:b w:val="0"/>
+          <w:i w:val="0"/>
         </w:rPr>
-        <w:t>AI engineer and senior data engineer with ~5 years in data engineering, building on earlier data-analyst experience, working across frontend, full-stack, backend, and AI automation. At TK Technologies, designed and built an automotive-parts pricing and stock data platform (async Python, n8n, Azure) and built frontend and full-stack features for a multi-model generative-AI chat platform (React, TypeScript, Tailwind). Previously built Python/SQL pipelines, Airflow-orchestrated ETL, data warehouses, and AWS lakehouses (Medallion, Delta Lake, Trino) for IoT, fintech, and agribusiness, handling LGPD/GDPR-governed data. Personal projects include a multi-tenant CRM with AI draft replies (FastAPI, Next.js, PostgreSQL), a local-first lakehouse (Prefect, dbt Core, DuckDB), and production RAG with pgvector (in progress). English: IELTS B2 (2025), self-assessed near C1.</w:t>
+        <w:t>AI engineer and senior data engineer with ~5 years in data engineering and earlier experience as a data analyst, working across frontend, full-stack, backend and AI automation. At a software company, I designed and built an auto-parts pricing and stock data platform (async Python, n8n, Azure) and built frontend and full-stack features for a multi-model generative AI chat platform (React, TypeScript, Tailwind). Before that, I built Python/SQL pipelines, Airflow-orchestrated ETL, data warehouses and AWS lakehouses (Medallion, Delta Lake, Trino) for IoT, fintech and agribusiness, with data governed under LGPD/GDPR. Personal projects include a multi-tenant CRM with AI reply suggestions (FastAPI, Next.js, PostgreSQL), a local-first lakehouse (Prefect, dbt Core, DuckDB), and a RAG project with pgvector that is still in progress and not yet in production. English: IELTS B2 (2025), self-assessed close to C1.</w:t>
       </w:r>
     </w:p>
     <w:p>
       <w:pPr>
-        <w:keepNext w:val="0"/>
-        <w:keepLines/>
-        <w:widowControl/>
-        <w:spacing w:before="80" w:after="40" w:lineRule="exact" w:line="80"/>
+        <w:spacing w:after="40" w:before="140"/>
         <w:pBdr>
-          <w:bottom w:val="single" w:sz="6" w:space="1" w:color="B0B0B0"/>
+          <w:bottom w:val="single" w:sz="6" w:space="1" w:color="444444"/>
         </w:pBdr>
-      </w:pPr>
-    </w:p>
-    <w:p>
-      <w:pPr>
-        <w:keepNext/>
-        <w:keepLines/>
-        <w:widowControl/>
-        <w:spacing w:before="40" w:after="60" w:lineRule="exact" w:line="280"/>
       </w:pPr>
       <w:r>
         <w:rPr>
-          <w:rFonts w:ascii="Calibri" w:hAnsi="Calibri" w:cs="Calibri" w:eastAsia="Calibri"/>
           <w:b/>
-          <w:sz w:val="22"/>
+          <w:i w:val="0"/>
+          <w:sz w:val="21"/>
         </w:rPr>
         <w:t>TECHNICAL SKILLS</w:t>
       </w:r>
     </w:p>
-    <w:tbl>
-      <w:tblPr>
-        <w:tblW w:type="dxa" w:w="10318"/>
-        <w:tblLayout w:type="fixed"/>
-        <w:tblLook w:firstColumn="1" w:firstRow="1" w:lastColumn="0" w:lastRow="0" w:noHBand="0" w:noVBand="1" w:val="04A0"/>
-        <w:tblBorders>
-          <w:top w:val="nil" w:sz="0" w:space="0" w:color="auto"/>
-          <w:left w:val="nil" w:sz="0" w:space="0" w:color="auto"/>
-          <w:bottom w:val="nil" w:sz="0" w:space="0" w:color="auto"/>
-          <w:right w:val="nil" w:sz="0" w:space="0" w:color="auto"/>
-          <w:insideH w:val="nil" w:sz="0" w:space="0" w:color="auto"/>
-          <w:insideV w:val="nil" w:sz="0" w:space="0" w:color="auto"/>
-        </w:tblBorders>
-        <w:tblCellMar>
-          <w:top w:w="20" w:type="dxa"/>
-          <w:left w:w="40" w:type="dxa"/>
-          <w:bottom w:w="20" w:type="dxa"/>
-          <w:right w:w="60" w:type="dxa"/>
-        </w:tblCellMar>
-      </w:tblPr>
-      <w:tblGrid>
-        <w:gridCol w:w="5159"/>
-        <w:gridCol w:w="5159"/>
-      </w:tblGrid>
-      <w:tr>
-        <w:tc>
-          <w:tcPr>
-            <w:tcW w:type="dxa" w:w="3198"/>
-          </w:tcPr>
-          <w:p>
-            <w:pPr>
-              <w:keepNext w:val="0"/>
-              <w:keepLines/>
-              <w:widowControl/>
-              <w:spacing w:before="20" w:after="20" w:lineRule="exact" w:line="240"/>
-            </w:pPr>
-            <w:r/>
-            <w:r>
-              <w:rPr>
-                <w:rFonts w:ascii="Calibri" w:hAnsi="Calibri" w:cs="Calibri" w:eastAsia="Calibri"/>
-                <w:b/>
-                <w:sz w:val="18"/>
-              </w:rPr>
-              <w:t>AI data &amp; LLM apps</w:t>
-            </w:r>
-          </w:p>
-        </w:tc>
-        <w:tc>
-          <w:tcPr>
-            <w:tcW w:type="dxa" w:w="7120"/>
-          </w:tcPr>
-          <w:p>
-            <w:pPr>
-              <w:keepNext w:val="0"/>
-              <w:keepLines/>
-              <w:widowControl/>
-              <w:spacing w:before="20" w:after="20" w:lineRule="exact" w:line="240"/>
-            </w:pPr>
-            <w:r/>
-            <w:r>
-              <w:rPr>
-                <w:rFonts w:ascii="Calibri" w:hAnsi="Calibri" w:cs="Calibri" w:eastAsia="Calibri"/>
-                <w:sz w:val="18"/>
-              </w:rPr>
-              <w:t>LLM integration (Claude, Google AI Studio), AI automation, AI coding agents, conversational data querying, n8n, prompt design, chatbots, Meta Cloud API</w:t>
-            </w:r>
-          </w:p>
-        </w:tc>
-      </w:tr>
-      <w:tr>
-        <w:tc>
-          <w:tcPr>
-            <w:tcW w:type="dxa" w:w="3198"/>
-          </w:tcPr>
-          <w:p>
-            <w:pPr>
-              <w:keepNext w:val="0"/>
-              <w:keepLines/>
-              <w:widowControl/>
-              <w:spacing w:before="20" w:after="20" w:lineRule="exact" w:line="240"/>
-            </w:pPr>
-            <w:r/>
-            <w:r>
-              <w:rPr>
-                <w:rFonts w:ascii="Calibri" w:hAnsi="Calibri" w:cs="Calibri" w:eastAsia="Calibri"/>
-                <w:b/>
-                <w:sz w:val="18"/>
-              </w:rPr>
-              <w:t>Data engineering</w:t>
-            </w:r>
-          </w:p>
-        </w:tc>
-        <w:tc>
-          <w:tcPr>
-            <w:tcW w:type="dxa" w:w="7120"/>
-          </w:tcPr>
-          <w:p>
-            <w:pPr>
-              <w:keepNext w:val="0"/>
-              <w:keepLines/>
-              <w:widowControl/>
-              <w:spacing w:before="20" w:after="20" w:lineRule="exact" w:line="240"/>
-            </w:pPr>
-            <w:r/>
-            <w:r>
-              <w:rPr>
-                <w:rFonts w:ascii="Calibri" w:hAnsi="Calibri" w:cs="Calibri" w:eastAsia="Calibri"/>
-                <w:sz w:val="18"/>
-              </w:rPr>
-              <w:t>Python, SQL, Pandas, Apache Spark (PySpark), Airflow, ETL/ELT, dimensional modelling, Delta Lake, Parquet, Trino, REST API ingestion, JSON Schema contracts, webhooks, Playwright, web scraping</w:t>
-            </w:r>
-          </w:p>
-        </w:tc>
-      </w:tr>
-      <w:tr>
-        <w:tc>
-          <w:tcPr>
-            <w:tcW w:type="dxa" w:w="3198"/>
-          </w:tcPr>
-          <w:p>
-            <w:pPr>
-              <w:keepNext w:val="0"/>
-              <w:keepLines/>
-              <w:widowControl/>
-              <w:spacing w:before="20" w:after="20" w:lineRule="exact" w:line="240"/>
-            </w:pPr>
-            <w:r/>
-            <w:r>
-              <w:rPr>
-                <w:rFonts w:ascii="Calibri" w:hAnsi="Calibri" w:cs="Calibri" w:eastAsia="Calibri"/>
-                <w:b/>
-                <w:sz w:val="18"/>
-              </w:rPr>
-              <w:t>Frontend &amp; full-stack</w:t>
-            </w:r>
-          </w:p>
-        </w:tc>
-        <w:tc>
-          <w:tcPr>
-            <w:tcW w:type="dxa" w:w="7120"/>
-          </w:tcPr>
-          <w:p>
-            <w:pPr>
-              <w:keepNext w:val="0"/>
-              <w:keepLines/>
-              <w:widowControl/>
-              <w:spacing w:before="20" w:after="20" w:lineRule="exact" w:line="240"/>
-            </w:pPr>
-            <w:r/>
-            <w:r>
-              <w:rPr>
-                <w:rFonts w:ascii="Calibri" w:hAnsi="Calibri" w:cs="Calibri" w:eastAsia="Calibri"/>
-                <w:sz w:val="18"/>
-              </w:rPr>
-              <w:t>React 18, TypeScript, Vite, Tailwind CSS, Figma-to-UI, Next.js, NestJS, FastAPI</w:t>
-            </w:r>
-          </w:p>
-        </w:tc>
-      </w:tr>
-      <w:tr>
-        <w:tc>
-          <w:tcPr>
-            <w:tcW w:type="dxa" w:w="3198"/>
-          </w:tcPr>
-          <w:p>
-            <w:pPr>
-              <w:keepNext w:val="0"/>
-              <w:keepLines/>
-              <w:widowControl/>
-              <w:spacing w:before="20" w:after="20" w:lineRule="exact" w:line="240"/>
-            </w:pPr>
-            <w:r/>
-            <w:r>
-              <w:rPr>
-                <w:rFonts w:ascii="Calibri" w:hAnsi="Calibri" w:cs="Calibri" w:eastAsia="Calibri"/>
-                <w:b/>
-                <w:sz w:val="18"/>
-              </w:rPr>
-              <w:t>Cloud &amp; delivery</w:t>
-            </w:r>
-          </w:p>
-        </w:tc>
-        <w:tc>
-          <w:tcPr>
-            <w:tcW w:type="dxa" w:w="7120"/>
-          </w:tcPr>
-          <w:p>
-            <w:pPr>
-              <w:keepNext w:val="0"/>
-              <w:keepLines/>
-              <w:widowControl/>
-              <w:spacing w:before="20" w:after="20" w:lineRule="exact" w:line="240"/>
-            </w:pPr>
-            <w:r/>
-            <w:r>
-              <w:rPr>
-                <w:rFonts w:ascii="Calibri" w:hAnsi="Calibri" w:cs="Calibri" w:eastAsia="Calibri"/>
-                <w:sz w:val="18"/>
-              </w:rPr>
-              <w:t>AWS, Azure, GCP, OCI, Docker, Azure Container Apps, Azure App Service, Bicep, Celery, Redis Streams, n8n, Git, GitHub Actions CI/CD</w:t>
-            </w:r>
-          </w:p>
-        </w:tc>
-      </w:tr>
-      <w:tr>
-        <w:tc>
-          <w:tcPr>
-            <w:tcW w:type="dxa" w:w="3198"/>
-          </w:tcPr>
-          <w:p>
-            <w:pPr>
-              <w:keepNext w:val="0"/>
-              <w:keepLines/>
-              <w:widowControl/>
-              <w:spacing w:before="20" w:after="20" w:lineRule="exact" w:line="240"/>
-            </w:pPr>
-            <w:r/>
-            <w:r>
-              <w:rPr>
-                <w:rFonts w:ascii="Calibri" w:hAnsi="Calibri" w:cs="Calibri" w:eastAsia="Calibri"/>
-                <w:b/>
-                <w:sz w:val="18"/>
-              </w:rPr>
-              <w:t>Databases &amp; BI</w:t>
-            </w:r>
-          </w:p>
-        </w:tc>
-        <w:tc>
-          <w:tcPr>
-            <w:tcW w:type="dxa" w:w="7120"/>
-          </w:tcPr>
-          <w:p>
-            <w:pPr>
-              <w:keepNext w:val="0"/>
-              <w:keepLines/>
-              <w:widowControl/>
-              <w:spacing w:before="20" w:after="20" w:lineRule="exact" w:line="240"/>
-            </w:pPr>
-            <w:r/>
-            <w:r>
-              <w:rPr>
-                <w:rFonts w:ascii="Calibri" w:hAnsi="Calibri" w:cs="Calibri" w:eastAsia="Calibri"/>
-                <w:sz w:val="18"/>
-              </w:rPr>
-              <w:t>PostgreSQL, SQL Server, Oracle Autonomous Database, Power BI, Qlik Sense, Apache Superset</w:t>
-            </w:r>
-          </w:p>
-        </w:tc>
-      </w:tr>
-      <w:tr>
-        <w:tc>
-          <w:tcPr>
-            <w:tcW w:type="dxa" w:w="3198"/>
-          </w:tcPr>
-          <w:p>
-            <w:pPr>
-              <w:keepNext w:val="0"/>
-              <w:keepLines/>
-              <w:widowControl/>
-              <w:spacing w:before="20" w:after="20" w:lineRule="exact" w:line="240"/>
-            </w:pPr>
-            <w:r/>
-            <w:r>
-              <w:rPr>
-                <w:rFonts w:ascii="Calibri" w:hAnsi="Calibri" w:cs="Calibri" w:eastAsia="Calibri"/>
-                <w:b/>
-                <w:sz w:val="18"/>
-              </w:rPr>
-              <w:t>Governance</w:t>
-            </w:r>
-          </w:p>
-        </w:tc>
-        <w:tc>
-          <w:tcPr>
-            <w:tcW w:type="dxa" w:w="7120"/>
-          </w:tcPr>
-          <w:p>
-            <w:pPr>
-              <w:keepNext w:val="0"/>
-              <w:keepLines/>
-              <w:widowControl/>
-              <w:spacing w:before="20" w:after="20" w:lineRule="exact" w:line="240"/>
-            </w:pPr>
-            <w:r/>
-            <w:r>
-              <w:rPr>
-                <w:rFonts w:ascii="Calibri" w:hAnsi="Calibri" w:cs="Calibri" w:eastAsia="Calibri"/>
-                <w:sz w:val="18"/>
-              </w:rPr>
-              <w:t>LGPD/GDPR, RBAC, data privacy</w:t>
-            </w:r>
-          </w:p>
-        </w:tc>
-      </w:tr>
-      <w:tr>
-        <w:tc>
-          <w:tcPr>
-            <w:tcW w:type="dxa" w:w="3198"/>
-          </w:tcPr>
-          <w:p>
-            <w:pPr>
-              <w:keepNext w:val="0"/>
-              <w:keepLines/>
-              <w:widowControl/>
-              <w:spacing w:before="20" w:after="20" w:lineRule="exact" w:line="240"/>
-            </w:pPr>
-            <w:r/>
-            <w:r>
-              <w:rPr>
-                <w:rFonts w:ascii="Calibri" w:hAnsi="Calibri" w:cs="Calibri" w:eastAsia="Calibri"/>
-                <w:b/>
-                <w:sz w:val="18"/>
-              </w:rPr>
-              <w:t>Labs (not client production)</w:t>
-            </w:r>
-          </w:p>
-        </w:tc>
-        <w:tc>
-          <w:tcPr>
-            <w:tcW w:type="dxa" w:w="7120"/>
-          </w:tcPr>
-          <w:p>
-            <w:pPr>
-              <w:keepNext w:val="0"/>
-              <w:keepLines/>
-              <w:widowControl/>
-              <w:spacing w:before="20" w:after="20" w:lineRule="exact" w:line="240"/>
-            </w:pPr>
-            <w:r/>
-            <w:r>
-              <w:rPr>
-                <w:rFonts w:ascii="Calibri" w:hAnsi="Calibri" w:cs="Calibri" w:eastAsia="Calibri"/>
-                <w:sz w:val="18"/>
-              </w:rPr>
-              <w:t>dbt Core, Prefect, DuckDB, Snowflake, pgvector/RAG (in progress)</w:t>
-            </w:r>
-          </w:p>
-        </w:tc>
-      </w:tr>
-      <w:tr>
-        <w:tc>
-          <w:tcPr>
-            <w:tcW w:type="dxa" w:w="3198"/>
-          </w:tcPr>
-          <w:p>
-            <w:pPr>
-              <w:keepNext w:val="0"/>
-              <w:keepLines/>
-              <w:widowControl/>
-              <w:spacing w:before="20" w:after="20" w:lineRule="exact" w:line="240"/>
-            </w:pPr>
-            <w:r/>
-            <w:r>
-              <w:rPr>
-                <w:rFonts w:ascii="Calibri" w:hAnsi="Calibri" w:cs="Calibri" w:eastAsia="Calibri"/>
-                <w:b/>
-                <w:sz w:val="18"/>
-              </w:rPr>
-              <w:t>Languages</w:t>
-            </w:r>
-          </w:p>
-        </w:tc>
-        <w:tc>
-          <w:tcPr>
-            <w:tcW w:type="dxa" w:w="7120"/>
-          </w:tcPr>
-          <w:p>
-            <w:pPr>
-              <w:keepNext w:val="0"/>
-              <w:keepLines/>
-              <w:widowControl/>
-              <w:spacing w:before="20" w:after="20" w:lineRule="exact" w:line="240"/>
-            </w:pPr>
-            <w:r/>
-            <w:r>
-              <w:rPr>
-                <w:rFonts w:ascii="Calibri" w:hAnsi="Calibri" w:cs="Calibri" w:eastAsia="Calibri"/>
-                <w:sz w:val="18"/>
-              </w:rPr>
-              <w:t>Portuguese (Native) · English (IELTS B2 (2025), self-assessed near C1) · Spanish (B1 – Intermediate)</w:t>
-            </w:r>
-          </w:p>
-        </w:tc>
-      </w:tr>
-    </w:tbl>
     <w:p>
       <w:pPr>
-        <w:keepNext w:val="0"/>
-        <w:keepLines/>
-        <w:widowControl/>
-        <w:spacing w:before="80" w:after="40" w:lineRule="exact" w:line="80"/>
-        <w:pBdr>
-          <w:bottom w:val="single" w:sz="6" w:space="1" w:color="B0B0B0"/>
-        </w:pBdr>
+        <w:tabs>
+          <w:tab w:pos="2608" w:val="left"/>
+        </w:tabs>
+        <w:spacing w:after="20"/>
+        <w:ind w:left="2608" w:hanging="2608"/>
       </w:pPr>
+      <w:r>
+        <w:rPr>
+          <w:b/>
+        </w:rPr>
+        <w:t>Data for AI &amp; LLM apps</w:t>
+      </w:r>
+      <w:r>
+        <w:tab/>
+        <w:t>LLM integration (Claude, Google AI Studio), AI automation, AI coding agents, conversational data querying, n8n, prompt design, chatbots, Meta Cloud API</w:t>
+      </w:r>
     </w:p>
     <w:p>
       <w:pPr>
-        <w:keepNext/>
-        <w:keepLines/>
-        <w:widowControl/>
-        <w:spacing w:before="40" w:after="60" w:lineRule="exact" w:line="280"/>
+        <w:tabs>
+          <w:tab w:pos="2608" w:val="left"/>
+        </w:tabs>
+        <w:spacing w:after="20"/>
+        <w:ind w:left="2608" w:hanging="2608"/>
       </w:pPr>
       <w:r>
         <w:rPr>
-          <w:rFonts w:ascii="Calibri" w:hAnsi="Calibri" w:cs="Calibri" w:eastAsia="Calibri"/>
           <w:b/>
-          <w:sz w:val="22"/>
+        </w:rPr>
+        <w:t>Data engineering</w:t>
+      </w:r>
+      <w:r>
+        <w:tab/>
+        <w:t>Python, SQL, Pandas, Apache Spark (PySpark), Airflow, ETL/ELT, dimensional modelling, Delta Lake, Parquet, Trino, REST API ingestion, JSON Schema contracts, webhooks, Playwright, web scraping</w:t>
+      </w:r>
+    </w:p>
+    <w:p>
+      <w:pPr>
+        <w:tabs>
+          <w:tab w:pos="2608" w:val="left"/>
+        </w:tabs>
+        <w:spacing w:after="20"/>
+        <w:ind w:left="2608" w:hanging="2608"/>
+      </w:pPr>
+      <w:r>
+        <w:rPr>
+          <w:b/>
+        </w:rPr>
+        <w:t>Frontend &amp; full-stack</w:t>
+      </w:r>
+      <w:r>
+        <w:tab/>
+        <w:t>React 18, TypeScript, Vite, Tailwind CSS, Figma for UI, Next.js, NestJS, FastAPI</w:t>
+      </w:r>
+    </w:p>
+    <w:p>
+      <w:pPr>
+        <w:tabs>
+          <w:tab w:pos="2608" w:val="left"/>
+        </w:tabs>
+        <w:spacing w:after="20"/>
+        <w:ind w:left="2608" w:hanging="2608"/>
+      </w:pPr>
+      <w:r>
+        <w:rPr>
+          <w:b/>
+        </w:rPr>
+        <w:t>Cloud &amp; delivery</w:t>
+      </w:r>
+      <w:r>
+        <w:tab/>
+        <w:t>AWS, Azure, GCP, OCI, Docker, Azure Container Apps, Azure App Service, Bicep, Celery, Redis Streams, n8n, Git, GitHub Actions CI/CD</w:t>
+      </w:r>
+    </w:p>
+    <w:p>
+      <w:pPr>
+        <w:tabs>
+          <w:tab w:pos="2608" w:val="left"/>
+        </w:tabs>
+        <w:spacing w:after="20"/>
+        <w:ind w:left="2608" w:hanging="2608"/>
+      </w:pPr>
+      <w:r>
+        <w:rPr>
+          <w:b/>
+        </w:rPr>
+        <w:t>Databases &amp; BI</w:t>
+      </w:r>
+      <w:r>
+        <w:tab/>
+        <w:t>PostgreSQL, SQL Server, Oracle Autonomous Database, Power BI, Qlik Sense, Apache Superset</w:t>
+      </w:r>
+    </w:p>
+    <w:p>
+      <w:pPr>
+        <w:tabs>
+          <w:tab w:pos="2608" w:val="left"/>
+        </w:tabs>
+        <w:spacing w:after="20"/>
+        <w:ind w:left="2608" w:hanging="2608"/>
+      </w:pPr>
+      <w:r>
+        <w:rPr>
+          <w:b/>
+        </w:rPr>
+        <w:t>Governance</w:t>
+      </w:r>
+      <w:r>
+        <w:tab/>
+        <w:t>LGPD/GDPR, RBAC, data privacy</w:t>
+      </w:r>
+    </w:p>
+    <w:p>
+      <w:pPr>
+        <w:tabs>
+          <w:tab w:pos="2608" w:val="left"/>
+        </w:tabs>
+        <w:spacing w:after="20"/>
+        <w:ind w:left="2608" w:hanging="2608"/>
+      </w:pPr>
+      <w:r>
+        <w:rPr>
+          <w:b/>
+        </w:rPr>
+        <w:t>Labs (personal projects, not production)</w:t>
+      </w:r>
+      <w:r>
+        <w:tab/>
+        <w:t>dbt Core, Prefect, DuckDB, Snowflake, pgvector/RAG (in progress)</w:t>
+      </w:r>
+    </w:p>
+    <w:p>
+      <w:pPr>
+        <w:tabs>
+          <w:tab w:pos="2608" w:val="left"/>
+        </w:tabs>
+        <w:spacing w:after="20"/>
+        <w:ind w:left="2608" w:hanging="2608"/>
+      </w:pPr>
+      <w:r>
+        <w:rPr>
+          <w:b/>
+        </w:rPr>
+        <w:t>Languages</w:t>
+      </w:r>
+      <w:r>
+        <w:tab/>
+        <w:t>Portuguese (Native) · English (IELTS B2, 2025; self-assessed close to C1) · Spanish (B1 – Intermediate)</w:t>
+      </w:r>
+    </w:p>
+    <w:p>
+      <w:pPr>
+        <w:spacing w:after="40" w:before="140"/>
+        <w:pBdr>
+          <w:bottom w:val="single" w:sz="6" w:space="1" w:color="444444"/>
+        </w:pBdr>
+      </w:pPr>
+      <w:r>
+        <w:rPr>
+          <w:b/>
+          <w:i w:val="0"/>
+          <w:sz w:val="21"/>
         </w:rPr>
         <w:t>WORK EXPERIENCE</w:t>
       </w:r>
     </w:p>
     <w:p>
       <w:pPr>
-        <w:keepNext/>
-        <w:keepLines/>
-        <w:widowControl/>
         <w:tabs>
-          <w:tab w:pos="10318" w:val="right"/>
+          <w:tab w:pos="9978" w:val="right"/>
         </w:tabs>
-        <w:spacing w:before="100" w:after="20" w:lineRule="exact" w:line="260"/>
+        <w:spacing w:before="80"/>
       </w:pPr>
       <w:r>
         <w:rPr>
-          <w:rFonts w:ascii="Calibri" w:hAnsi="Calibri" w:cs="Calibri" w:eastAsia="Calibri"/>
           <w:b/>
-          <w:sz w:val="21"/>
         </w:rPr>
-        <w:t>Gen AI Engineer (AI Data &amp; Full-Stack Engineering) — TK Technologies | Curitiba, PR – Brazil (Hybrid)</w:t>
-      </w:r>
-      <w:r>
-        <w:tab/>
+        <w:t>Generative AI Engineer (Data for AI &amp; Full-Stack Engineering) — Software company (name on request) | Curitiba, PR (Hybrid, Contract)</w:t>
       </w:r>
       <w:r>
         <w:rPr>
-          <w:rFonts w:ascii="Calibri" w:hAnsi="Calibri" w:cs="Calibri" w:eastAsia="Calibri"/>
-          <w:i/>
-          <w:sz w:val="19"/>
+          <w:b/>
         </w:rPr>
-        <w:t>Feb 2026 – Present · Contract</w:t>
+        <w:tab/>
+        <w:t>Feb 2026 – Present</w:t>
       </w:r>
     </w:p>
     <w:p>
       <w:pPr>
         <w:pStyle w:val="ListBullet"/>
-        <w:keepNext w:val="0"/>
-        <w:keepLines/>
-        <w:widowControl/>
-        <w:spacing w:before="0" w:after="20" w:lineRule="exact" w:line="240"/>
-        <w:ind w:left="255" w:hanging="142"/>
+        <w:spacing w:after="20"/>
+        <w:ind w:left="340"/>
       </w:pPr>
       <w:r>
-        <w:rPr>
-          <w:rFonts w:ascii="Calibri" w:hAnsi="Calibri" w:cs="Calibri" w:eastAsia="Calibri"/>
-          <w:sz w:val="19"/>
-        </w:rPr>
-        <w:t>Designed and built, nearly alone, an automotive-parts pricing and stock data platform that takes SKU requests from chat, email, schedules, and spreadsheets and runs web scraping and internal inventory lookups in parallel.</w:t>
+        <w:t>Designed and built, largely on my own, an auto-parts pricing and stock data platform that takes SKU requests from chat, email, schedules and spreadsheets, and runs web scraping and internal stock lookups in parallel.</w:t>
       </w:r>
     </w:p>
     <w:p>
       <w:pPr>
         <w:pStyle w:val="ListBullet"/>
-        <w:keepNext w:val="0"/>
-        <w:keepLines/>
-        <w:widowControl/>
-        <w:spacing w:before="0" w:after="20" w:lineRule="exact" w:line="240"/>
-        <w:ind w:left="255" w:hanging="142"/>
+        <w:spacing w:after="20"/>
+        <w:ind w:left="340"/>
       </w:pPr>
       <w:r>
-        <w:rPr>
-          <w:rFonts w:ascii="Calibri" w:hAnsi="Calibri" w:cs="Calibri" w:eastAsia="Calibri"/>
-          <w:sz w:val="19"/>
-        </w:rPr>
-        <w:t>Built async Python services (FastAPI, Celery, Redis Streams, Playwright) with caching, JSON Schema contracts, and webhook callbacks, orchestrated with n8n.</w:t>
+        <w:t>Built async Python services (FastAPI, Celery, Redis Streams, Playwright) with caching, JSON Schema contracts and webhook callbacks, orchestrated with n8n.</w:t>
       </w:r>
     </w:p>
     <w:p>
       <w:pPr>
         <w:pStyle w:val="ListBullet"/>
-        <w:keepNext w:val="0"/>
-        <w:keepLines/>
-        <w:widowControl/>
-        <w:spacing w:before="0" w:after="20" w:lineRule="exact" w:line="240"/>
-        <w:ind w:left="255" w:hanging="142"/>
+        <w:spacing w:after="20"/>
+        <w:ind w:left="340"/>
       </w:pPr>
       <w:r>
-        <w:rPr>
-          <w:rFonts w:ascii="Calibri" w:hAnsi="Calibri" w:cs="Calibri" w:eastAsia="Calibri"/>
-          <w:sz w:val="19"/>
-        </w:rPr>
-        <w:t>Deployed separate dev and prod environments on Azure with Bicep IaC, containers, and GitHub Actions CI/CD, adding health checks, outage guardrails, quotas, and access control.</w:t>
+        <w:t>Deployed separate dev and prod environments on Azure with Bicep IaC, containers and GitHub Actions CI/CD, including health checks, outage safeguards, quotas and access control.</w:t>
       </w:r>
     </w:p>
     <w:p>
       <w:pPr>
         <w:pStyle w:val="ListBullet"/>
-        <w:keepNext w:val="0"/>
-        <w:keepLines/>
-        <w:widowControl/>
-        <w:spacing w:before="0" w:after="20" w:lineRule="exact" w:line="240"/>
-        <w:ind w:left="255" w:hanging="142"/>
+        <w:spacing w:after="20"/>
+        <w:ind w:left="340"/>
       </w:pPr>
       <w:r>
-        <w:rPr>
-          <w:rFonts w:ascii="Calibri" w:hAnsi="Calibri" w:cs="Calibri" w:eastAsia="Calibri"/>
-          <w:sz w:val="19"/>
-        </w:rPr>
-        <w:t>Delivered automated spreadsheet reporting and dashboards with clear outcome statuses and Telegram/email notifications, using AI coding agents throughout.</w:t>
+        <w:t>Delivered automated reports in spreadsheets and dashboards with clear result statuses and Telegram/email notifications, using AI coding agents throughout the process.</w:t>
       </w:r>
     </w:p>
     <w:p>
       <w:pPr>
         <w:pStyle w:val="ListBullet"/>
-        <w:keepNext w:val="0"/>
-        <w:keepLines/>
-        <w:widowControl/>
-        <w:spacing w:before="0" w:after="20" w:lineRule="exact" w:line="240"/>
-        <w:ind w:left="255" w:hanging="142"/>
+        <w:spacing w:after="20"/>
+        <w:ind w:left="340"/>
       </w:pPr>
       <w:r>
-        <w:rPr>
-          <w:rFonts w:ascii="Calibri" w:hAnsi="Calibri" w:cs="Calibri" w:eastAsia="Calibri"/>
-          <w:sz w:val="19"/>
-        </w:rPr>
-        <w:t>Built a full-stack web workspace for the automotive-parts pricing platform: a React + TypeScript + Vite + Tailwind frontend with chat-based SKU lookups, results tables and an executive analytics dashboard (KPIs, catalog, site coverage, SKU benchmarking), tested with Vitest.</w:t>
+        <w:t>Built a full-stack web workspace for the pricing platform: a React + TypeScript + Vite + Tailwind frontend with chat-based SKU queries, results tables and an executive analytics dashboard (KPIs, catalogue, site coverage, SKU benchmarking), tested with Vitest.</w:t>
       </w:r>
     </w:p>
     <w:p>
       <w:pPr>
         <w:pStyle w:val="ListBullet"/>
-        <w:keepNext w:val="0"/>
-        <w:keepLines/>
-        <w:widowControl/>
-        <w:spacing w:before="0" w:after="20" w:lineRule="exact" w:line="240"/>
-        <w:ind w:left="255" w:hanging="142"/>
+        <w:spacing w:after="20"/>
+        <w:ind w:left="340"/>
       </w:pPr>
       <w:r>
-        <w:rPr>
-          <w:rFonts w:ascii="Calibri" w:hAnsi="Calibri" w:cs="Calibri" w:eastAsia="Calibri"/>
-          <w:sz w:val="19"/>
-        </w:rPr>
-        <w:t>Designed the FastAPI/Postgres backend behind it: authentication, per-tenant data isolation, an append-only audit log, and a two-stage (raw-to-cleaned) data pipeline that turns scraper and inventory results into certified metrics.</w:t>
+        <w:t>Designed the FastAPI/Postgres backend behind it: authentication, per-tenant data isolation, an append-only audit log and a two-stage data pipeline (raw to curated) that turns scraping and stock results into certified metrics.</w:t>
       </w:r>
     </w:p>
     <w:p>
       <w:pPr>
         <w:pStyle w:val="ListBullet"/>
-        <w:keepNext w:val="0"/>
-        <w:keepLines/>
-        <w:widowControl/>
-        <w:spacing w:before="0" w:after="20" w:lineRule="exact" w:line="240"/>
-        <w:ind w:left="255" w:hanging="142"/>
+        <w:spacing w:after="20"/>
+        <w:ind w:left="340"/>
       </w:pPr>
       <w:r>
-        <w:rPr>
-          <w:rFonts w:ascii="Calibri" w:hAnsi="Calibri" w:cs="Calibri" w:eastAsia="Calibri"/>
-          <w:sz w:val="19"/>
-        </w:rPr>
-        <w:t>Built frontend and full-stack features for a multi-model generative-AI chat platform in React 18, TypeScript, Vite, and Tailwind CSS: ~17 Figma-designed screens and ~6 chat input features (image generation, deep research, artifacts, file attachments, audio input), with 12 merged PRs in ~4 weeks as implementer under tech-lead review.</w:t>
+        <w:t>Built frontend and full-stack features for a multi-model generative AI chat platform with React 18, TypeScript, Vite and Tailwind CSS: ~17 screens designed in Figma and ~6 chat-input features (image generation, deep research, artifacts, file attachments, audio input), with 12 PRs merged in ~4 weeks as an implementer, under tech lead review.</w:t>
       </w:r>
     </w:p>
     <w:p>
       <w:pPr>
         <w:pStyle w:val="ListBullet"/>
-        <w:keepNext w:val="0"/>
-        <w:keepLines/>
-        <w:widowControl/>
-        <w:spacing w:before="0" w:after="20" w:lineRule="exact" w:line="240"/>
-        <w:ind w:left="255" w:hanging="142"/>
+        <w:spacing w:after="20"/>
+        <w:ind w:left="340"/>
       </w:pPr>
       <w:r>
-        <w:rPr>
-          <w:rFonts w:ascii="Calibri" w:hAnsi="Calibri" w:cs="Calibri" w:eastAsia="Calibri"/>
-          <w:sz w:val="19"/>
-        </w:rPr>
-        <w:t>Delivered through Jira-tracked tasks, conventional commits, QA and visual regression evidence, and review-gated merges, with GitHub Actions CI/CD to Azure App Service.</w:t>
+        <w:t>Delivered through tracked Jira tasks, conventional commits, QA and visual regression evidence and review-gated merges, with GitHub Actions CI/CD on Azure App Service.</w:t>
       </w:r>
     </w:p>
     <w:p>
       <w:pPr>
-        <w:keepNext/>
-        <w:keepLines/>
-        <w:widowControl/>
-        <w:spacing w:before="100" w:after="20" w:lineRule="exact" w:line="260"/>
+        <w:tabs>
+          <w:tab w:pos="9978" w:val="right"/>
+        </w:tabs>
+        <w:spacing w:before="80"/>
       </w:pPr>
       <w:r>
         <w:rPr>
-          <w:rFonts w:ascii="Calibri" w:hAnsi="Calibri" w:cs="Calibri" w:eastAsia="Calibri"/>
           <w:b/>
-          <w:sz w:val="21"/>
         </w:rPr>
-        <w:t>Career break</w:t>
+        <w:t>Career break — London, UK</w:t>
       </w:r>
       <w:r>
         <w:rPr>
-          <w:rFonts w:ascii="Calibri" w:hAnsi="Calibri" w:cs="Calibri" w:eastAsia="Calibri"/>
-          <w:i/>
-          <w:sz w:val="18"/>
+          <w:b/>
         </w:rPr>
-        <w:t xml:space="preserve">  ·  Oct 2024 – Oct 2025</w:t>
+        <w:tab/>
+        <w:t>Oct 2024 – Oct 2025</w:t>
       </w:r>
     </w:p>
     <w:p>
       <w:pPr>
         <w:pStyle w:val="ListBullet"/>
-        <w:keepNext w:val="0"/>
-        <w:keepLines/>
-        <w:widowControl/>
-        <w:spacing w:before="0" w:after="20" w:lineRule="exact" w:line="240"/>
-        <w:ind w:left="255" w:hanging="142"/>
+        <w:spacing w:after="20"/>
+        <w:ind w:left="340"/>
       </w:pPr>
       <w:r>
-        <w:rPr>
-          <w:rFonts w:ascii="Calibri" w:hAnsi="Calibri" w:cs="Calibri" w:eastAsia="Calibri"/>
-          <w:sz w:val="19"/>
-        </w:rPr>
-        <w:t>English exchange in London, UK (daily immersion, IELTS B2) and upskilling studies, incl. IBM Introduction to Data Engineering.</w:t>
+        <w:t>English exchange in London, UK (daily immersion, IELTS B2) and professional upskilling studies, including IBM Introduction to Data Engineering.</w:t>
       </w:r>
     </w:p>
     <w:p>
       <w:pPr>
-        <w:keepNext/>
-        <w:keepLines/>
-        <w:widowControl/>
         <w:tabs>
-          <w:tab w:pos="10318" w:val="right"/>
+          <w:tab w:pos="9978" w:val="right"/>
         </w:tabs>
-        <w:spacing w:before="100" w:after="20" w:lineRule="exact" w:line="260"/>
+        <w:spacing w:before="80"/>
       </w:pPr>
       <w:r>
         <w:rPr>
-          <w:rFonts w:ascii="Calibri" w:hAnsi="Calibri" w:cs="Calibri" w:eastAsia="Calibri"/>
           <w:b/>
-          <w:sz w:val="21"/>
         </w:rPr>
-        <w:t>Data Engineer — Spacecom Monitoramento | Curitiba, PR – Brazil (On-site)</w:t>
-      </w:r>
-      <w:r>
-        <w:tab/>
+        <w:t>Data Engineer — Spacecom Monitoramento | Curitiba, PR (On-site)</w:t>
       </w:r>
       <w:r>
         <w:rPr>
-          <w:rFonts w:ascii="Calibri" w:hAnsi="Calibri" w:cs="Calibri" w:eastAsia="Calibri"/>
-          <w:i/>
-          <w:sz w:val="19"/>
+          <w:b/>
         </w:rPr>
+        <w:tab/>
         <w:t>Apr 2023 – Jul 2024</w:t>
       </w:r>
     </w:p>
     <w:p>
       <w:pPr>
         <w:pStyle w:val="ListBullet"/>
-        <w:keepNext w:val="0"/>
-        <w:keepLines/>
-        <w:widowControl/>
-        <w:spacing w:before="0" w:after="20" w:lineRule="exact" w:line="240"/>
-        <w:ind w:left="255" w:hanging="142"/>
+        <w:spacing w:after="20"/>
+        <w:ind w:left="340"/>
       </w:pPr>
       <w:r>
-        <w:rPr>
-          <w:rFonts w:ascii="Calibri" w:hAnsi="Calibri" w:cs="Calibri" w:eastAsia="Calibri"/>
-          <w:sz w:val="19"/>
-        </w:rPr>
-        <w:t>Designed and maintained an enterprise Big Data Lakehouse on AWS S3 leveraging Medallion Architecture (Bronze/Silver/Gold) alongside Delta Lake, Parquet, PySpark, and Trino to support heavy analytics workloads.</w:t>
+        <w:t>Designed and maintained a Big Data Lakehouse on AWS S3 with Medallion Architecture (Bronze/Silver/Gold) using Delta Lake, Parquet, PySpark and Trino, supporting analytics and reporting workloads.</w:t>
       </w:r>
     </w:p>
     <w:p>
       <w:pPr>
         <w:pStyle w:val="ListBullet"/>
-        <w:keepNext w:val="0"/>
-        <w:keepLines/>
-        <w:widowControl/>
-        <w:spacing w:before="0" w:after="20" w:lineRule="exact" w:line="240"/>
-        <w:ind w:left="255" w:hanging="142"/>
+        <w:spacing w:after="20"/>
+        <w:ind w:left="340"/>
       </w:pPr>
       <w:r>
-        <w:rPr>
-          <w:rFonts w:ascii="Calibri" w:hAnsi="Calibri" w:cs="Calibri" w:eastAsia="Calibri"/>
-          <w:sz w:val="19"/>
-        </w:rPr>
-        <w:t>Supported a high-availability IoT platform scaling to 95,000+ devices, efficiently processing hundreds of millions of telemetry records per day.</w:t>
+        <w:t>Supported a large-scale IoT platform processing data from 95,000+ devices, with hundreds of millions of records per day at high availability.</w:t>
       </w:r>
     </w:p>
     <w:p>
       <w:pPr>
         <w:pStyle w:val="ListBullet"/>
-        <w:keepNext w:val="0"/>
-        <w:keepLines/>
-        <w:widowControl/>
-        <w:spacing w:before="0" w:after="20" w:lineRule="exact" w:line="240"/>
-        <w:ind w:left="255" w:hanging="142"/>
+        <w:spacing w:after="20"/>
+        <w:ind w:left="340"/>
       </w:pPr>
       <w:r>
-        <w:rPr>
-          <w:rFonts w:ascii="Calibri" w:hAnsi="Calibri" w:cs="Calibri" w:eastAsia="Calibri"/>
-          <w:sz w:val="19"/>
-        </w:rPr>
-        <w:t>Managed electronic security tag (RFID/NFC) data for government court systems, ensuring strict LGPD/GDPR compliance through robust data privacy controls, access governance, and secure handling of sensitive judicial data.</w:t>
+        <w:t>Managed electronic security tag (RFID/NFC) data for judicial systems, applying privacy controls, access governance and secure handling of sensitive data in line with LGPD/GDPR.</w:t>
       </w:r>
     </w:p>
     <w:p>
       <w:pPr>
         <w:pStyle w:val="ListBullet"/>
-        <w:keepNext w:val="0"/>
-        <w:keepLines/>
-        <w:widowControl/>
-        <w:spacing w:before="0" w:after="20" w:lineRule="exact" w:line="240"/>
-        <w:ind w:left="255" w:hanging="142"/>
+        <w:spacing w:after="20"/>
+        <w:ind w:left="340"/>
       </w:pPr>
       <w:r>
-        <w:rPr>
-          <w:rFonts w:ascii="Calibri" w:hAnsi="Calibri" w:cs="Calibri" w:eastAsia="Calibri"/>
-          <w:sz w:val="19"/>
-        </w:rPr>
-        <w:t>Orchestrated and optimised ETL pipelines with Apache Airflow, reducing failure rates by ~30%; utilised Docker on AWS EC2 to cut deployment issues by an additional ~25%.</w:t>
+        <w:t>Orchestrated and optimised ETL pipelines with Apache Airflow, reducing failures by ~30%; deployed services with Docker on AWS EC2, cutting deployment issues by ~25%.</w:t>
       </w:r>
     </w:p>
     <w:p>
       <w:pPr>
         <w:pStyle w:val="ListBullet"/>
-        <w:keepNext w:val="0"/>
-        <w:keepLines/>
-        <w:widowControl/>
-        <w:spacing w:before="0" w:after="20" w:lineRule="exact" w:line="240"/>
-        <w:ind w:left="255" w:hanging="142"/>
+        <w:spacing w:after="20"/>
+        <w:ind w:left="340"/>
       </w:pPr>
       <w:r>
-        <w:rPr>
-          <w:rFonts w:ascii="Calibri" w:hAnsi="Calibri" w:cs="Calibri" w:eastAsia="Calibri"/>
-          <w:sz w:val="19"/>
-        </w:rPr>
-        <w:t>Remediated inconsistencies in pipeline steps to boost downstream analytics accuracy by ~40%, successfully delivering reliable datasets to Qlik Sense and Apache Superset dashboards.</w:t>
+        <w:t>Found and fixed inconsistent pipeline steps, improving data accuracy by ~40%; delivered datasets consumed by Qlik Sense and Apache Superset dashboards.</w:t>
       </w:r>
     </w:p>
     <w:p>
       <w:pPr>
-        <w:keepNext/>
-        <w:keepLines/>
-        <w:widowControl/>
         <w:tabs>
-          <w:tab w:pos="10318" w:val="right"/>
+          <w:tab w:pos="9978" w:val="right"/>
         </w:tabs>
-        <w:spacing w:before="100" w:after="20" w:lineRule="exact" w:line="260"/>
+        <w:spacing w:before="80"/>
       </w:pPr>
       <w:r>
         <w:rPr>
-          <w:rFonts w:ascii="Calibri" w:hAnsi="Calibri" w:cs="Calibri" w:eastAsia="Calibri"/>
           <w:b/>
-          <w:sz w:val="21"/>
         </w:rPr>
-        <w:t>Data Engineer Consultant — wDiscover | Curitiba, PR – Brazil (Remote)</w:t>
-      </w:r>
-      <w:r>
-        <w:tab/>
+        <w:t>Data Engineering Consultant — wDiscover | Curitiba, PR (Remote)</w:t>
       </w:r>
       <w:r>
         <w:rPr>
-          <w:rFonts w:ascii="Calibri" w:hAnsi="Calibri" w:cs="Calibri" w:eastAsia="Calibri"/>
-          <w:i/>
-          <w:sz w:val="19"/>
+          <w:b/>
         </w:rPr>
+        <w:tab/>
         <w:t>Jun 2022 – May 2024</w:t>
       </w:r>
     </w:p>
     <w:p>
       <w:pPr>
         <w:pStyle w:val="ListBullet"/>
-        <w:keepNext w:val="0"/>
-        <w:keepLines/>
-        <w:widowControl/>
-        <w:spacing w:before="0" w:after="20" w:lineRule="exact" w:line="240"/>
-        <w:ind w:left="255" w:hanging="142"/>
+        <w:spacing w:after="20"/>
+        <w:ind w:left="340"/>
       </w:pPr>
       <w:r>
-        <w:rPr>
-          <w:rFonts w:ascii="Calibri" w:hAnsi="Calibri" w:cs="Calibri" w:eastAsia="Calibri"/>
-          <w:sz w:val="19"/>
-        </w:rPr>
-        <w:t>Delivered end-to-end data projects across the fintech, agribusiness, and operations sectors by integrating high-volume payment providers (PagSeguro, Stone, Cielo), John Deere IoT APIs, and REST APIs.</w:t>
+        <w:t>Delivered end-to-end data projects for fintech, agribusiness and operations clients, integrating payment providers (PagSeguro, Stone, Cielo), the John Deere IoT API, REST APIs and web scraping.</w:t>
       </w:r>
     </w:p>
     <w:p>
       <w:pPr>
         <w:pStyle w:val="ListBullet"/>
-        <w:keepNext w:val="0"/>
-        <w:keepLines/>
-        <w:widowControl/>
-        <w:spacing w:before="0" w:after="20" w:lineRule="exact" w:line="240"/>
-        <w:ind w:left="255" w:hanging="142"/>
+        <w:spacing w:after="20"/>
+        <w:ind w:left="340"/>
       </w:pPr>
       <w:r>
-        <w:rPr>
-          <w:rFonts w:ascii="Calibri" w:hAnsi="Calibri" w:cs="Calibri" w:eastAsia="Calibri"/>
-          <w:sz w:val="19"/>
-        </w:rPr>
-        <w:t>Designed dimensional Data Warehouses on SQL Server and Oracle Autonomous Database; automated complex ETL workflows with Airflow on Docker/Oracle Cloud to reduce manual effort by ~35%.</w:t>
+        <w:t>Designed dimensional Data Warehouses on SQL Server and Oracle Autonomous Database; automated ETL with Airflow on Docker/Oracle Cloud, reducing manual effort by ~35%.</w:t>
       </w:r>
     </w:p>
     <w:p>
       <w:pPr>
         <w:pStyle w:val="ListBullet"/>
-        <w:keepNext w:val="0"/>
-        <w:keepLines/>
-        <w:widowControl/>
-        <w:spacing w:before="0" w:after="20" w:lineRule="exact" w:line="240"/>
-        <w:ind w:left="255" w:hanging="142"/>
+        <w:spacing w:after="20"/>
+        <w:ind w:left="340"/>
       </w:pPr>
       <w:r>
-        <w:rPr>
-          <w:rFonts w:ascii="Calibri" w:hAnsi="Calibri" w:cs="Calibri" w:eastAsia="Calibri"/>
-          <w:sz w:val="19"/>
-        </w:rPr>
-        <w:t>Built dynamic Power BI dashboards to track critical KPIs, financial metrics, and operational performance for diverse client domains.</w:t>
+        <w:t>Built Power BI dashboards to monitor KPIs, financial metrics and operational performance, enabling data-driven decisions for stakeholders.</w:t>
       </w:r>
     </w:p>
     <w:p>
       <w:pPr>
-        <w:keepNext/>
-        <w:keepLines/>
-        <w:widowControl/>
         <w:tabs>
-          <w:tab w:pos="10318" w:val="right"/>
+          <w:tab w:pos="9978" w:val="right"/>
         </w:tabs>
-        <w:spacing w:before="100" w:after="20" w:lineRule="exact" w:line="260"/>
+        <w:spacing w:before="80"/>
       </w:pPr>
       <w:r>
         <w:rPr>
-          <w:rFonts w:ascii="Calibri" w:hAnsi="Calibri" w:cs="Calibri" w:eastAsia="Calibri"/>
           <w:b/>
-          <w:sz w:val="21"/>
         </w:rPr>
-        <w:t>Data Analyst — Itaete Group | Curitiba, PR – Brazil (Hybrid)</w:t>
-      </w:r>
-      <w:r>
-        <w:tab/>
+        <w:t>Data Analyst — Itaeté Group | Curitiba, PR (Hybrid)</w:t>
       </w:r>
       <w:r>
         <w:rPr>
-          <w:rFonts w:ascii="Calibri" w:hAnsi="Calibri" w:cs="Calibri" w:eastAsia="Calibri"/>
-          <w:i/>
-          <w:sz w:val="19"/>
+          <w:b/>
         </w:rPr>
+        <w:tab/>
         <w:t>Jun 2020 – Feb 2023</w:t>
       </w:r>
     </w:p>
     <w:p>
       <w:pPr>
         <w:pStyle w:val="ListBullet"/>
-        <w:keepNext w:val="0"/>
-        <w:keepLines/>
-        <w:widowControl/>
-        <w:spacing w:before="0" w:after="20" w:lineRule="exact" w:line="240"/>
-        <w:ind w:left="255" w:hanging="142"/>
+        <w:spacing w:after="20"/>
+        <w:ind w:left="340"/>
       </w:pPr>
       <w:r>
-        <w:rPr>
-          <w:rFonts w:ascii="Calibri" w:hAnsi="Calibri" w:cs="Calibri" w:eastAsia="Calibri"/>
-          <w:sz w:val="19"/>
-        </w:rPr>
-        <w:t>Designed a SQL Server Data Warehouse and robust Python/SQL pipelines using Pandas to cleanse, transform, and enrich data from IoT devices, PostgreSQL, APIs, and CSV sources.</w:t>
+        <w:t>Designed a SQL Server Data Warehouse and Python/SQL pipelines with Pandas to clean, transform and enrich data from IoT devices, PostgreSQL, APIs and CSV files.</w:t>
       </w:r>
     </w:p>
     <w:p>
       <w:pPr>
         <w:pStyle w:val="ListBullet"/>
-        <w:keepNext w:val="0"/>
-        <w:keepLines/>
-        <w:widowControl/>
-        <w:spacing w:before="0" w:after="20" w:lineRule="exact" w:line="240"/>
-        <w:ind w:left="255" w:hanging="142"/>
+        <w:spacing w:after="20"/>
+        <w:ind w:left="340"/>
       </w:pPr>
       <w:r>
-        <w:rPr>
-          <w:rFonts w:ascii="Calibri" w:hAnsi="Calibri" w:cs="Calibri" w:eastAsia="Calibri"/>
-          <w:sz w:val="19"/>
-        </w:rPr>
-        <w:t>Built Power BI dashboards and automated legacy Excel/VBA reporting workflows, slashing data processing time by ~50% and significantly reducing manual operational workloads.</w:t>
+        <w:t>Built Power BI dashboards and automated Excel/VBA reporting workflows, cutting data processing time by ~50% and reducing manual operational work.</w:t>
       </w:r>
     </w:p>
     <w:p>
       <w:pPr>
         <w:pStyle w:val="ListBullet"/>
-        <w:keepNext w:val="0"/>
-        <w:keepLines/>
-        <w:widowControl/>
-        <w:spacing w:before="0" w:after="20" w:lineRule="exact" w:line="240"/>
-        <w:ind w:left="255" w:hanging="142"/>
+        <w:spacing w:after="20"/>
+        <w:ind w:left="340"/>
       </w:pPr>
       <w:r>
-        <w:rPr>
-          <w:rFonts w:ascii="Calibri" w:hAnsi="Calibri" w:cs="Calibri" w:eastAsia="Calibri"/>
-          <w:sz w:val="19"/>
-        </w:rPr>
-        <w:t>Developed internal systems for inventory management and financial automation, streamlining invoice generation and automated weekly report distribution.</w:t>
+        <w:t>Developed internal inventory control and financial automation systems, including invoice generation and automated weekly report distribution.</w:t>
       </w:r>
     </w:p>
     <w:p>
       <w:pPr>
-        <w:keepNext w:val="0"/>
-        <w:keepLines/>
-        <w:widowControl/>
-        <w:spacing w:before="80" w:after="40" w:lineRule="exact" w:line="80"/>
+        <w:spacing w:after="40" w:before="140"/>
         <w:pBdr>
-          <w:bottom w:val="single" w:sz="6" w:space="1" w:color="B0B0B0"/>
+          <w:bottom w:val="single" w:sz="6" w:space="1" w:color="444444"/>
         </w:pBdr>
-      </w:pPr>
-    </w:p>
-    <w:p>
-      <w:pPr>
-        <w:keepNext/>
-        <w:keepLines/>
-        <w:widowControl/>
-        <w:spacing w:before="40" w:after="60" w:lineRule="exact" w:line="280"/>
       </w:pPr>
       <w:r>
         <w:rPr>
-          <w:rFonts w:ascii="Calibri" w:hAnsi="Calibri" w:cs="Calibri" w:eastAsia="Calibri"/>
           <w:b/>
-          <w:sz w:val="22"/>
+          <w:i w:val="0"/>
+          <w:sz w:val="21"/>
         </w:rPr>
         <w:t>NOTABLE PROJECTS</w:t>
       </w:r>
     </w:p>
     <w:p>
       <w:pPr>
-        <w:keepNext/>
-        <w:keepLines/>
-        <w:widowControl/>
-        <w:spacing w:before="100" w:after="20" w:lineRule="exact" w:line="260"/>
+        <w:spacing w:before="60"/>
       </w:pPr>
       <w:r>
         <w:rPr>
-          <w:rFonts w:ascii="Calibri" w:hAnsi="Calibri" w:cs="Calibri" w:eastAsia="Calibri"/>
           <w:b/>
-          <w:sz w:val="21"/>
         </w:rPr>
         <w:t>Omnichannel AI Platform (private)</w:t>
       </w:r>
       <w:r>
         <w:rPr>
-          <w:rFonts w:ascii="Calibri" w:hAnsi="Calibri" w:cs="Calibri" w:eastAsia="Calibri"/>
           <w:i/>
-          <w:sz w:val="18"/>
         </w:rPr>
-        <w:t xml:space="preserve">  ·  NestJS, Next.js, PostgreSQL, LLMs, Meta &amp; Google Ads APIs, Azure Container Apps, Docker  ·  TK Technologies – Jun 2026 – Present</w:t>
+        <w:t xml:space="preserve"> · NestJS, Next.js, PostgreSQL, LLMs, Meta &amp; Google Ads APIs, Azure Container Apps, Docker · Software company – Jun 2026 – Present</w:t>
       </w:r>
     </w:p>
     <w:p>
       <w:pPr>
         <w:pStyle w:val="ListBullet"/>
-        <w:keepNext w:val="0"/>
-        <w:keepLines/>
-        <w:widowControl/>
-        <w:spacing w:before="0" w:after="20" w:lineRule="exact" w:line="240"/>
-        <w:ind w:left="255" w:hanging="142"/>
+        <w:spacing w:after="20"/>
+        <w:ind w:left="340"/>
       </w:pPr>
       <w:r>
-        <w:rPr>
-          <w:rFonts w:ascii="Calibri" w:hAnsi="Calibri" w:cs="Calibri" w:eastAsia="Calibri"/>
-          <w:sz w:val="19"/>
-        </w:rPr>
-        <w:t>Built a secure omnichannel CRM integrating WhatsApp, Instagram, Facebook, Telegram, and Email into a unified inbox with role-based access control (RBAC).</w:t>
+        <w:t>Built a secure omnichannel CRM that brings WhatsApp, Instagram, Facebook, Telegram and email into one inbox with role-based access control (RBAC).</w:t>
       </w:r>
     </w:p>
     <w:p>
       <w:pPr>
         <w:pStyle w:val="ListBullet"/>
-        <w:keepNext w:val="0"/>
-        <w:keepLines/>
-        <w:widowControl/>
-        <w:spacing w:before="0" w:after="20" w:lineRule="exact" w:line="240"/>
-        <w:ind w:left="255" w:hanging="142"/>
+        <w:spacing w:after="20"/>
+        <w:ind w:left="340"/>
       </w:pPr>
       <w:r>
-        <w:rPr>
-          <w:rFonts w:ascii="Calibri" w:hAnsi="Calibri" w:cs="Calibri" w:eastAsia="Calibri"/>
-          <w:sz w:val="19"/>
-        </w:rPr>
-        <w:t>Layered Meta/Google Ads performance data and LLMs (Claude/Google AI Studio) for auto-replies, outbound messaging assistance, and automated campaign analysis.</w:t>
+        <w:t>Connected Meta and Google Ads performance data and an LLM layer (Claude/Google AI Studio) for auto-replies, outbound messaging and automated campaign analysis.</w:t>
       </w:r>
     </w:p>
     <w:p>
       <w:pPr>
-        <w:keepNext/>
-        <w:keepLines/>
-        <w:widowControl/>
-        <w:spacing w:before="100" w:after="20" w:lineRule="exact" w:line="260"/>
+        <w:spacing w:before="60"/>
       </w:pPr>
       <w:r>
         <w:rPr>
-          <w:rFonts w:ascii="Calibri" w:hAnsi="Calibri" w:cs="Calibri" w:eastAsia="Calibri"/>
           <w:b/>
-          <w:sz w:val="21"/>
         </w:rPr>
         <w:t>Automotive Parts Price Search (private)</w:t>
       </w:r>
       <w:r>
         <w:rPr>
-          <w:rFonts w:ascii="Calibri" w:hAnsi="Calibri" w:cs="Calibri" w:eastAsia="Calibri"/>
           <w:i/>
-          <w:sz w:val="18"/>
         </w:rPr>
-        <w:t xml:space="preserve">  ·  Python, FastAPI, Celery, Playwright, Redis, PostgreSQL, n8n, Azure, Bicep  ·  TK Technologies – Feb 2026 – Present</w:t>
+        <w:t xml:space="preserve"> · Python, FastAPI, Celery, Playwright, Redis, PostgreSQL, n8n, Azure, Bicep · Software company – Feb 2026 – Present</w:t>
       </w:r>
     </w:p>
     <w:p>
       <w:pPr>
         <w:pStyle w:val="ListBullet"/>
-        <w:keepNext w:val="0"/>
-        <w:keepLines/>
-        <w:widowControl/>
-        <w:spacing w:before="0" w:after="20" w:lineRule="exact" w:line="240"/>
-        <w:ind w:left="255" w:hanging="142"/>
+        <w:spacing w:after="20"/>
+        <w:ind w:left="340"/>
       </w:pPr>
       <w:r>
-        <w:rPr>
-          <w:rFonts w:ascii="Calibri" w:hAnsi="Calibri" w:cs="Calibri" w:eastAsia="Calibri"/>
-          <w:sz w:val="19"/>
-        </w:rPr>
-        <w:t>Built a car-parts price searcher across 10+ sites, with parallel public-price and internal-stock lookup, auditable reporting, and notifications from containerised Azure services.</w:t>
+        <w:t>Built a parts price searcher across 10+ sites, with parallel public-price and internal-stock search, auditable reports and notifications on containerised Azure services.</w:t>
       </w:r>
     </w:p>
     <w:p>
       <w:pPr>
-        <w:keepNext/>
-        <w:keepLines/>
-        <w:widowControl/>
-        <w:spacing w:before="100" w:after="20" w:lineRule="exact" w:line="260"/>
+        <w:spacing w:before="60"/>
       </w:pPr>
       <w:r>
         <w:rPr>
-          <w:rFonts w:ascii="Calibri" w:hAnsi="Calibri" w:cs="Calibri" w:eastAsia="Calibri"/>
           <w:b/>
-          <w:sz w:val="21"/>
         </w:rPr>
         <w:t>IoT Data Lakehouse on AWS – Medallion Architecture</w:t>
       </w:r>
       <w:r>
         <w:rPr>
-          <w:rFonts w:ascii="Calibri" w:hAnsi="Calibri" w:cs="Calibri" w:eastAsia="Calibri"/>
           <w:i/>
-          <w:sz w:val="18"/>
         </w:rPr>
-        <w:t xml:space="preserve">  ·  AWS S3, Apache Spark, Delta Lake, Airflow, Trino, Apache Superset  ·  Client Project – Feb 2024</w:t>
+        <w:t xml:space="preserve"> · AWS S3, Apache Spark, Delta Lake, Airflow, Trino, Apache Superset · Client project – Feb 2024</w:t>
       </w:r>
     </w:p>
     <w:p>
       <w:pPr>
         <w:pStyle w:val="ListBullet"/>
-        <w:keepNext w:val="0"/>
-        <w:keepLines/>
-        <w:widowControl/>
-        <w:spacing w:before="0" w:after="20" w:lineRule="exact" w:line="240"/>
-        <w:ind w:left="255" w:hanging="142"/>
+        <w:spacing w:after="20"/>
+        <w:ind w:left="340"/>
       </w:pPr>
       <w:r>
-        <w:rPr>
-          <w:rFonts w:ascii="Calibri" w:hAnsi="Calibri" w:cs="Calibri" w:eastAsia="Calibri"/>
-          <w:sz w:val="19"/>
-        </w:rPr>
-        <w:t>Designed a Bronze/Silver/Gold lakehouse on AWS S3 ingesting from APIs and databases. Virtualised the Gold layer with Trino and surfaced governed datasets through BI dashboards.</w:t>
+        <w:t>Designed a Bronze/Silver/Gold lakehouse on AWS S3 with ingestion from APIs and databases; virtualised the Gold layer with Trino and delivered governed datasets to BI dashboards.</w:t>
       </w:r>
     </w:p>
     <w:p>
       <w:pPr>
-        <w:keepNext w:val="0"/>
-        <w:keepLines/>
-        <w:widowControl/>
-        <w:spacing w:before="80" w:after="40" w:lineRule="exact" w:line="80"/>
+        <w:spacing w:after="40" w:before="140"/>
         <w:pBdr>
-          <w:bottom w:val="single" w:sz="6" w:space="1" w:color="B0B0B0"/>
+          <w:bottom w:val="single" w:sz="6" w:space="1" w:color="444444"/>
         </w:pBdr>
-      </w:pPr>
-    </w:p>
-    <w:p>
-      <w:pPr>
-        <w:keepNext/>
-        <w:keepLines/>
-        <w:widowControl/>
-        <w:spacing w:before="40" w:after="60" w:lineRule="exact" w:line="280"/>
       </w:pPr>
       <w:r>
         <w:rPr>
-          <w:rFonts w:ascii="Calibri" w:hAnsi="Calibri" w:cs="Calibri" w:eastAsia="Calibri"/>
           <w:b/>
-          <w:sz w:val="22"/>
+          <w:i w:val="0"/>
+          <w:sz w:val="21"/>
         </w:rPr>
         <w:t>EDUCATION</w:t>
       </w:r>
     </w:p>
     <w:p>
       <w:pPr>
-        <w:keepNext w:val="0"/>
-        <w:keepLines/>
-        <w:widowControl/>
-        <w:spacing w:before="80" w:after="20" w:lineRule="exact" w:line="260"/>
+        <w:spacing w:after="0" w:before="0"/>
       </w:pPr>
       <w:r>
         <w:rPr>
-          <w:rFonts w:ascii="Calibri" w:hAnsi="Calibri" w:cs="Calibri" w:eastAsia="Calibri"/>
           <w:b/>
-          <w:sz w:val="20"/>
+          <w:i w:val="0"/>
         </w:rPr>
-        <w:t>Bachelor of Systems Analysis and Development — Dom Bosco University, Curitiba, Brazil · Jun 2023</w:t>
+        <w:t>Bachelor of Systems Analysis and Development (Tecnólogo) — Dom Bosco University, Curitiba, PR · Jun 2023</w:t>
       </w:r>
     </w:p>
     <w:p>
       <w:pPr>
-        <w:keepNext w:val="0"/>
-        <w:keepLines/>
-        <w:widowControl/>
-        <w:spacing w:before="0" w:after="20" w:lineRule="exact" w:line="250"/>
+        <w:spacing w:after="0" w:before="0"/>
       </w:pPr>
       <w:r>
         <w:rPr>
-          <w:rFonts w:ascii="Calibri" w:hAnsi="Calibri" w:cs="Calibri" w:eastAsia="Calibri"/>
-          <w:sz w:val="20"/>
+          <w:b w:val="0"/>
+          <w:i w:val="0"/>
         </w:rPr>
-        <w:t>Majors: Information Systems · Business Analytics · Data Analysis · Database Systems · Software Engineering</w:t>
+        <w:t>Focus areas: Information Systems, Business Analytics, Data Analysis, Databases, Software Engineering</w:t>
       </w:r>
     </w:p>
     <w:p>
       <w:pPr>
-        <w:keepNext w:val="0"/>
-        <w:keepLines/>
-        <w:widowControl/>
-        <w:spacing w:before="80" w:after="40" w:lineRule="exact" w:line="80"/>
+        <w:spacing w:after="40" w:before="140"/>
         <w:pBdr>
-          <w:bottom w:val="single" w:sz="6" w:space="1" w:color="B0B0B0"/>
+          <w:bottom w:val="single" w:sz="6" w:space="1" w:color="444444"/>
         </w:pBdr>
-      </w:pPr>
-    </w:p>
-    <w:p>
-      <w:pPr>
-        <w:keepNext/>
-        <w:keepLines/>
-        <w:widowControl/>
-        <w:spacing w:before="40" w:after="60" w:lineRule="exact" w:line="280"/>
       </w:pPr>
       <w:r>
         <w:rPr>
-          <w:rFonts w:ascii="Calibri" w:hAnsi="Calibri" w:cs="Calibri" w:eastAsia="Calibri"/>
           <w:b/>
-          <w:sz w:val="22"/>
+          <w:i w:val="0"/>
+          <w:sz w:val="21"/>
         </w:rPr>
         <w:t>LICENSES &amp; CERTIFICATIONS</w:t>
       </w:r>
@@ -1288,159 +739,96 @@
     <w:p>
       <w:pPr>
         <w:pStyle w:val="ListBullet"/>
-        <w:keepNext w:val="0"/>
-        <w:keepLines/>
-        <w:widowControl/>
-        <w:spacing w:before="0" w:after="20" w:lineRule="exact" w:line="240"/>
-        <w:ind w:left="255" w:hanging="142"/>
+        <w:spacing w:after="20"/>
+        <w:ind w:left="340"/>
       </w:pPr>
       <w:r>
-        <w:rPr>
-          <w:rFonts w:ascii="Calibri" w:hAnsi="Calibri" w:cs="Calibri" w:eastAsia="Calibri"/>
-          <w:sz w:val="19"/>
-        </w:rPr>
         <w:t>IELTS General — IELTS B2 (band 5.5, Sep 2025)</w:t>
       </w:r>
     </w:p>
     <w:p>
       <w:pPr>
         <w:pStyle w:val="ListBullet"/>
-        <w:keepNext w:val="0"/>
-        <w:keepLines/>
-        <w:widowControl/>
-        <w:spacing w:before="0" w:after="20" w:lineRule="exact" w:line="240"/>
-        <w:ind w:left="255" w:hanging="142"/>
+        <w:spacing w:after="20"/>
+        <w:ind w:left="340"/>
       </w:pPr>
       <w:r>
-        <w:rPr>
-          <w:rFonts w:ascii="Calibri" w:hAnsi="Calibri" w:cs="Calibri" w:eastAsia="Calibri"/>
-          <w:sz w:val="19"/>
-        </w:rPr>
         <w:t>AI for Writing and Communicating — Google (Credential ID: HE8YE5IS7WVW) · Jul 2026</w:t>
       </w:r>
     </w:p>
     <w:p>
       <w:pPr>
         <w:pStyle w:val="ListBullet"/>
-        <w:keepNext w:val="0"/>
-        <w:keepLines/>
-        <w:widowControl/>
-        <w:spacing w:before="0" w:after="20" w:lineRule="exact" w:line="240"/>
-        <w:ind w:left="255" w:hanging="142"/>
+        <w:spacing w:after="20"/>
+        <w:ind w:left="340"/>
       </w:pPr>
       <w:r>
-        <w:rPr>
-          <w:rFonts w:ascii="Calibri" w:hAnsi="Calibri" w:cs="Calibri" w:eastAsia="Calibri"/>
-          <w:sz w:val="19"/>
-        </w:rPr>
         <w:t>AI for Research and Insights — Google (Credential ID: 4PZDF3XQOF55) · Jul 2026</w:t>
       </w:r>
     </w:p>
     <w:p>
       <w:pPr>
         <w:pStyle w:val="ListBullet"/>
-        <w:keepNext w:val="0"/>
-        <w:keepLines/>
-        <w:widowControl/>
-        <w:spacing w:before="0" w:after="20" w:lineRule="exact" w:line="240"/>
-        <w:ind w:left="255" w:hanging="142"/>
+        <w:spacing w:after="20"/>
+        <w:ind w:left="340"/>
       </w:pPr>
       <w:r>
-        <w:rPr>
-          <w:rFonts w:ascii="Calibri" w:hAnsi="Calibri" w:cs="Calibri" w:eastAsia="Calibri"/>
-          <w:sz w:val="19"/>
-        </w:rPr>
         <w:t>AI for Brainstorming and Planning — Google (Credential ID: 7SFW2HGOKIU5) · Jul 2026</w:t>
       </w:r>
     </w:p>
     <w:p>
       <w:pPr>
         <w:pStyle w:val="ListBullet"/>
-        <w:keepNext w:val="0"/>
-        <w:keepLines/>
-        <w:widowControl/>
-        <w:spacing w:before="0" w:after="20" w:lineRule="exact" w:line="240"/>
-        <w:ind w:left="255" w:hanging="142"/>
+        <w:spacing w:after="20"/>
+        <w:ind w:left="340"/>
       </w:pPr>
       <w:r>
-        <w:rPr>
-          <w:rFonts w:ascii="Calibri" w:hAnsi="Calibri" w:cs="Calibri" w:eastAsia="Calibri"/>
-          <w:sz w:val="19"/>
-        </w:rPr>
         <w:t>AI Fundamentals — Google (Credential ID: UKBGM0AZUIS2) · Jul 2026</w:t>
       </w:r>
     </w:p>
     <w:p>
       <w:pPr>
         <w:pStyle w:val="ListBullet"/>
-        <w:keepNext w:val="0"/>
-        <w:keepLines/>
-        <w:widowControl/>
-        <w:spacing w:before="0" w:after="20" w:lineRule="exact" w:line="240"/>
-        <w:ind w:left="255" w:hanging="142"/>
+        <w:spacing w:after="20"/>
+        <w:ind w:left="340"/>
       </w:pPr>
       <w:r>
-        <w:rPr>
-          <w:rFonts w:ascii="Calibri" w:hAnsi="Calibri" w:cs="Calibri" w:eastAsia="Calibri"/>
-          <w:sz w:val="19"/>
-        </w:rPr>
         <w:t>Introduction to Data Engineering — IBM · Jan 2025</w:t>
       </w:r>
     </w:p>
     <w:p>
       <w:pPr>
         <w:pStyle w:val="ListBullet"/>
-        <w:keepNext w:val="0"/>
-        <w:keepLines/>
-        <w:widowControl/>
-        <w:spacing w:before="0" w:after="20" w:lineRule="exact" w:line="240"/>
-        <w:ind w:left="255" w:hanging="142"/>
+        <w:spacing w:after="20"/>
+        <w:ind w:left="340"/>
       </w:pPr>
       <w:r>
-        <w:rPr>
-          <w:rFonts w:ascii="Calibri" w:hAnsi="Calibri" w:cs="Calibri" w:eastAsia="Calibri"/>
-          <w:sz w:val="19"/>
-        </w:rPr>
         <w:t>Docker Essentials — LINUXtips · Jun 2024</w:t>
       </w:r>
     </w:p>
     <w:p>
       <w:pPr>
         <w:pStyle w:val="ListBullet"/>
-        <w:keepNext w:val="0"/>
-        <w:keepLines/>
-        <w:widowControl/>
-        <w:spacing w:before="0" w:after="20" w:lineRule="exact" w:line="240"/>
-        <w:ind w:left="255" w:hanging="142"/>
+        <w:spacing w:after="20"/>
+        <w:ind w:left="340"/>
       </w:pPr>
       <w:r>
-        <w:rPr>
-          <w:rFonts w:ascii="Calibri" w:hAnsi="Calibri" w:cs="Calibri" w:eastAsia="Calibri"/>
-          <w:sz w:val="19"/>
-        </w:rPr>
         <w:t>AWS Cloud Practitioner Essentials — AWS (Coursera) · Apr 2024</w:t>
       </w:r>
     </w:p>
     <w:p>
       <w:pPr>
         <w:pStyle w:val="ListBullet"/>
-        <w:keepNext w:val="0"/>
-        <w:keepLines/>
-        <w:widowControl/>
-        <w:spacing w:before="0" w:after="20" w:lineRule="exact" w:line="240"/>
-        <w:ind w:left="255" w:hanging="142"/>
+        <w:spacing w:after="20"/>
+        <w:ind w:left="340"/>
       </w:pPr>
       <w:r>
-        <w:rPr>
-          <w:rFonts w:ascii="Calibri" w:hAnsi="Calibri" w:cs="Calibri" w:eastAsia="Calibri"/>
-          <w:sz w:val="19"/>
-        </w:rPr>
         <w:t>AWS Discovery Day — Ka Solution · Feb 2024</w:t>
       </w:r>
     </w:p>
     <w:sectPr>
       <w:pgSz w:w="11906" w:h="16838"/>
-      <w:pgMar w:top="652" w:right="794" w:bottom="652" w:left="794" w:header="720" w:footer="720" w:gutter="0"/>
+      <w:pgMar w:top="737" w:right="964" w:bottom="680" w:left="964" w:header="720" w:footer="720" w:gutter="0"/>
       <w:cols w:space="720"/>
       <w:docGrid w:linePitch="360"/>
     </w:sectPr>
@@ -1812,11 +1200,11 @@
     <w:qFormat/>
     <w:rsid w:val="00FC693F"/>
     <w:pPr>
-      <w:spacing w:before="0" w:after="0" w:line="240" w:lineRule="auto"/>
+      <w:spacing w:after="0" w:before="0"/>
     </w:pPr>
     <w:rPr>
-      <w:rFonts w:ascii="Calibri" w:hAnsi="Calibri" w:cs="Calibri" w:eastAsia="Calibri"/>
-      <w:sz w:val="20"/>
+      <w:rFonts w:ascii="Calibri" w:hAnsi="Calibri" w:eastAsia="Calibri"/>
+      <w:sz w:val="18"/>
     </w:rPr>
   </w:style>
   <w:style w:type="paragraph" w:styleId="Header">

</xml_diff>

<commit_message>
ZUR-101: Restore career break wording, generic CRM project name, PT CV v2 and buttons
</commit_message>
<xml_diff>
--- a/docs/resume/word/LucasCruz_CV_EN.docx
+++ b/docs/resume/word/LucasCruz_CV_EN.docx
@@ -380,7 +380,7 @@
         <w:rPr>
           <w:b/>
         </w:rPr>
-        <w:t>Career break — London, UK</w:t>
+        <w:t>Career break — English immersion &amp; tech upskilling | London, England</w:t>
       </w:r>
       <w:r>
         <w:rPr>
@@ -397,7 +397,7 @@
         <w:ind w:left="340"/>
       </w:pPr>
       <w:r>
-        <w:t>English exchange in London, UK (daily immersion, IELTS B2) and professional upskilling studies, including IBM Introduction to Data Engineering.</w:t>
+        <w:t>English immersion in London (daily immersion, IELTS B2) and technology courses, including IBM Introduction to Data Engineering, while learning about tech in the European business context.</w:t>
       </w:r>
     </w:p>
     <w:p>
@@ -597,7 +597,7 @@
         <w:rPr>
           <w:b/>
         </w:rPr>
-        <w:t>Omnichannel AI Platform (private)</w:t>
+        <w:t>Omnichannel CRM Platform (private)</w:t>
       </w:r>
       <w:r>
         <w:rPr>

</xml_diff>

<commit_message>
ZUR-102: rebuild CV PDFs and DOCX without phone
</commit_message>
<xml_diff>
--- a/docs/resume/word/LucasCruz_CV_EN.docx
+++ b/docs/resume/word/LucasCruz_CV_EN.docx
@@ -49,7 +49,7 @@
           <w:rFonts w:ascii="Calibri" w:hAnsi="Calibri" w:cs="Calibri" w:eastAsia="Calibri"/>
           <w:sz w:val="19"/>
         </w:rPr>
-        <w:t>+55 (21) 96552-9308 · dev.lucascruz@gmail.com · linkedin.com/in/lucas-cruz · devzurc.github.io/portfolio</w:t>
+        <w:t>dev.lucascruz@gmail.com · linkedin.com/in/lucas-cruz · devzurc.github.io/portfolio</w:t>
       </w:r>
     </w:p>
     <w:p>
@@ -548,7 +548,7 @@
           <w:rFonts w:ascii="Calibri" w:hAnsi="Calibri" w:cs="Calibri" w:eastAsia="Calibri"/>
           <w:sz w:val="19"/>
         </w:rPr>
-        <w:t>Built OrbitAI, an omnichannel AI CRM (WhatsApp, Instagram, Facebook, Telegram, and email) with role-based access, Meta/Google Ads tracking, and LLM replies, deployed on Azure Container Apps with Bicep.</w:t>
+        <w:t>Built an omnichannel AI CRM (WhatsApp, Instagram, Facebook, Telegram, and email) with role-based access, Meta/Google Ads tracking, and LLM replies, deployed on Azure Container Apps with Bicep.</w:t>
       </w:r>
     </w:p>
     <w:p>
@@ -936,7 +936,7 @@
           <w:b/>
           <w:sz w:val="21"/>
         </w:rPr>
-        <w:t>OrbitAI — Omnichannel AI CRM</w:t>
+        <w:t>Omnichannel AI CRM</w:t>
       </w:r>
       <w:r>
         <w:rPr>
@@ -961,7 +961,7 @@
           <w:rFonts w:ascii="Calibri" w:hAnsi="Calibri" w:cs="Calibri" w:eastAsia="Calibri"/>
           <w:sz w:val="19"/>
         </w:rPr>
-        <w:t>Built OrbitAI, a secure omnichannel CRM integrating WhatsApp, Instagram, Facebook, Telegram, and Email into a unified inbox with role-based access control (RBAC).</w:t>
+        <w:t>Built a secure omnichannel CRM integrating WhatsApp, Instagram, Facebook, Telegram, and Email into a unified inbox with role-based access control (RBAC).</w:t>
       </w:r>
     </w:p>
     <w:p>

</xml_diff>

<commit_message>
ZUR-102: sync GitHub career evidence and refine portfolio and CV copy
</commit_message>
<xml_diff>
--- a/docs/resume/word/LucasCruz_CV_EN.docx
+++ b/docs/resume/word/LucasCruz_CV_EN.docx
@@ -107,7 +107,7 @@
           <w:rFonts w:ascii="Calibri" w:hAnsi="Calibri" w:cs="Calibri" w:eastAsia="Calibri"/>
           <w:sz w:val="20"/>
         </w:rPr>
-        <w:t>I build production data pipelines, cloud lakehouses, and LLM/n8n workflows across IoT, fintech, agribusiness, and automotive products, with 5+ years in data roles and English at C1. I am learning production RAG, evaluation, and observability. Those are not shipped systems yet.</w:t>
+        <w:t>Senior Data Engineer and Gen. AI Automation Engineer with 5+ years building production data pipelines, AWS Medallion lakehouses, and LLM/n8n operational workflows across IoT, fintech, agribusiness, and automotive intelligence. Experienced in end-to-end delivery from Python/FastAPI/TypeScript services and governed datasets to containerized Azure/AWS deployments, CI/CD quality gates, and stakeholder-facing product delivery (English C1).</w:t>
       </w:r>
     </w:p>
     <w:p>
@@ -201,7 +201,7 @@
                 <w:rFonts w:ascii="Calibri" w:hAnsi="Calibri" w:cs="Calibri" w:eastAsia="Calibri"/>
                 <w:sz w:val="18"/>
               </w:rPr>
-              <w:t>LLM integration (Claude, Google AI Studio), n8n, prompt design, chatbots, Meta Cloud API</w:t>
+              <w:t>LLM integration (Claude, Google AI Studio, xAI Grok), n8n, LangChain agents, prompt design, chatbots, Meta Cloud API, webhooks</w:t>
             </w:r>
           </w:p>
         </w:tc>
@@ -246,7 +246,7 @@
                 <w:rFonts w:ascii="Calibri" w:hAnsi="Calibri" w:cs="Calibri" w:eastAsia="Calibri"/>
                 <w:sz w:val="18"/>
               </w:rPr>
-              <w:t>Python, SQL, Apache Spark (PySpark), Pandas, Airflow, Delta Lake, Parquet, Trino, Playwright, web scraping</w:t>
+              <w:t>Python, SQL, Apache Spark (PySpark), Pandas, Apache Airflow, Delta Lake, Parquet, Trino, Playwright, web scraping</w:t>
             </w:r>
           </w:p>
         </w:tc>
@@ -270,7 +270,7 @@
                 <w:b/>
                 <w:sz w:val="18"/>
               </w:rPr>
-              <w:t>Cloud &amp; delivery</w:t>
+              <w:t>Cloud, backend &amp; delivery</w:t>
             </w:r>
           </w:p>
         </w:tc>
@@ -291,7 +291,7 @@
                 <w:rFonts w:ascii="Calibri" w:hAnsi="Calibri" w:cs="Calibri" w:eastAsia="Calibri"/>
                 <w:sz w:val="18"/>
               </w:rPr>
-              <w:t>AWS, Azure, GCP, OCI, Docker, Azure Container Apps, Bicep, FastAPI, NestJS, Next.js, Celery, Redis, Git, CI/CD</w:t>
+              <w:t>AWS, Azure, GCP, OCI, Docker, Azure Container Apps, Bicep (IaC), FastAPI, TypeScript, NestJS, Next.js, Celery, Redis / Streams, Pydantic, Git, GitHub Actions (CI/CD), pytest</w:t>
             </w:r>
           </w:p>
         </w:tc>
@@ -381,7 +381,7 @@
                 <w:rFonts w:ascii="Calibri" w:hAnsi="Calibri" w:cs="Calibri" w:eastAsia="Calibri"/>
                 <w:sz w:val="18"/>
               </w:rPr>
-              <w:t>LGPD/GDPR, RBAC, data privacy</w:t>
+              <w:t>LGPD/GDPR compliance, RBAC, data privacy, schema contracts (JSON Schema)</w:t>
             </w:r>
           </w:p>
         </w:tc>

</xml_diff>